<commit_message>
Update MAS, being draw block diagram and timing for rr_arbiter, draw timing for ahb interconnect
</commit_message>
<xml_diff>
--- a/docs/SimpleMCU_MAS.docx
+++ b/docs/SimpleMCU_MAS.docx
@@ -673,8 +673,8 @@
         <w:jc w:val="left"/>
         <w:rPr>
           <w:rFonts w:hint="default" w:asciiTheme="majorEastAsia" w:hAnsiTheme="majorEastAsia" w:eastAsiaTheme="majorEastAsia" w:cstheme="majorEastAsia"/>
-          <w:b/>
-          <w:bCs/>
+          <w:b w:val="0"/>
+          <w:bCs w:val="0"/>
           <w:color w:val="auto"/>
           <w:sz w:val="20"/>
           <w:szCs w:val="20"/>
@@ -691,6 +691,20 @@
         </w:rPr>
         <w:t>&lt;Some introductions about main function&gt;</w:t>
       </w:r>
+    </w:p>
+    <w:p>
+      <w:pPr>
+        <w:ind w:left="0" w:leftChars="0" w:firstLine="400" w:firstLineChars="200"/>
+        <w:jc w:val="left"/>
+        <w:rPr>
+          <w:rFonts w:hint="default" w:asciiTheme="majorEastAsia" w:hAnsiTheme="majorEastAsia" w:eastAsiaTheme="majorEastAsia" w:cstheme="majorEastAsia"/>
+          <w:b w:val="0"/>
+          <w:bCs w:val="0"/>
+          <w:color w:val="auto"/>
+          <w:sz w:val="20"/>
+          <w:szCs w:val="20"/>
+        </w:rPr>
+      </w:pPr>
     </w:p>
     <w:p>
       <w:pPr>
@@ -5193,33 +5207,7 @@
                 <w:sz w:val="20"/>
                 <w:szCs w:val="20"/>
               </w:rPr>
-              <w:t>“${PROJ_ROOT}/rtl</w:t>
-            </w:r>
-            <w:r>
-              <w:rPr>
-                <w:rFonts w:hint="default" w:asciiTheme="majorEastAsia" w:hAnsiTheme="majorEastAsia" w:eastAsiaTheme="majorEastAsia" w:cstheme="majorEastAsia"/>
-                <w:b w:val="0"/>
-                <w:bCs w:val="0"/>
-                <w:i w:val="0"/>
-                <w:iCs w:val="0"/>
-                <w:color w:val="auto"/>
-                <w:sz w:val="20"/>
-                <w:szCs w:val="20"/>
-              </w:rPr>
-              <w:t>/common</w:t>
-            </w:r>
-            <w:r>
-              <w:rPr>
-                <w:rFonts w:hint="default" w:asciiTheme="majorEastAsia" w:hAnsiTheme="majorEastAsia" w:eastAsiaTheme="majorEastAsia" w:cstheme="majorEastAsia"/>
-                <w:b w:val="0"/>
-                <w:bCs w:val="0"/>
-                <w:i w:val="0"/>
-                <w:iCs w:val="0"/>
-                <w:color w:val="auto"/>
-                <w:sz w:val="20"/>
-                <w:szCs w:val="20"/>
-              </w:rPr>
-              <w:t>/”</w:t>
+              <w:t>“${PROJ_ROOT}/rtl/common/”</w:t>
             </w:r>
           </w:p>
         </w:tc>
@@ -5331,35 +5319,652 @@
                 <w:sz w:val="20"/>
                 <w:szCs w:val="20"/>
               </w:rPr>
-              <w:t>“spmcu_</w:t>
-            </w:r>
-            <w:r>
-              <w:rPr>
-                <w:rFonts w:hint="default" w:asciiTheme="majorEastAsia" w:hAnsiTheme="majorEastAsia" w:eastAsiaTheme="majorEastAsia" w:cstheme="majorEastAsia"/>
-                <w:b w:val="0"/>
-                <w:bCs w:val="0"/>
-                <w:i w:val="0"/>
-                <w:iCs w:val="0"/>
-                <w:color w:val="auto"/>
-                <w:sz w:val="20"/>
-                <w:szCs w:val="20"/>
-              </w:rPr>
-              <w:t>rr_arbiter</w:t>
-            </w:r>
-            <w:bookmarkStart w:id="0" w:name="_GoBack"/>
-            <w:bookmarkEnd w:id="0"/>
-            <w:r>
-              <w:rPr>
-                <w:rFonts w:hint="default" w:asciiTheme="majorEastAsia" w:hAnsiTheme="majorEastAsia" w:eastAsiaTheme="majorEastAsia" w:cstheme="majorEastAsia"/>
-                <w:b w:val="0"/>
-                <w:bCs w:val="0"/>
-                <w:i w:val="0"/>
-                <w:iCs w:val="0"/>
-                <w:color w:val="auto"/>
-                <w:sz w:val="20"/>
-                <w:szCs w:val="20"/>
-              </w:rPr>
-              <w:t>.sv”</w:t>
+              <w:t>“spmcu_rr_arbiter.sv”</w:t>
+            </w:r>
+          </w:p>
+        </w:tc>
+      </w:tr>
+    </w:tbl>
+    <w:p>
+      <w:pPr>
+        <w:numPr>
+          <w:ilvl w:val="0"/>
+          <w:numId w:val="0"/>
+        </w:numPr>
+        <w:ind w:left="0" w:leftChars="0" w:firstLine="400" w:firstLineChars="200"/>
+        <w:jc w:val="both"/>
+        <w:outlineLvl w:val="0"/>
+        <w:rPr>
+          <w:rFonts w:hint="default" w:asciiTheme="majorEastAsia" w:hAnsiTheme="majorEastAsia" w:eastAsiaTheme="majorEastAsia" w:cstheme="majorEastAsia"/>
+          <w:b w:val="0"/>
+          <w:bCs w:val="0"/>
+          <w:i w:val="0"/>
+          <w:iCs w:val="0"/>
+          <w:color w:val="auto"/>
+          <w:sz w:val="20"/>
+          <w:szCs w:val="20"/>
+        </w:rPr>
+      </w:pPr>
+      <w:r>
+        <w:rPr>
+          <w:rFonts w:hint="default" w:asciiTheme="majorEastAsia" w:hAnsiTheme="majorEastAsia" w:eastAsiaTheme="majorEastAsia" w:cstheme="majorEastAsia"/>
+          <w:b w:val="0"/>
+          <w:bCs w:val="0"/>
+          <w:i w:val="0"/>
+          <w:iCs w:val="0"/>
+          <w:color w:val="auto"/>
+          <w:sz w:val="20"/>
+          <w:szCs w:val="20"/>
+        </w:rPr>
+        <w:t>&lt;Chuc nang, tinh nang, diem dac biet&gt;</w:t>
+      </w:r>
+      <w:r>
+        <w:rPr>
+          <w:rFonts w:hint="default" w:asciiTheme="majorEastAsia" w:hAnsiTheme="majorEastAsia" w:eastAsiaTheme="majorEastAsia" w:cstheme="majorEastAsia"/>
+          <w:b w:val="0"/>
+          <w:bCs w:val="0"/>
+          <w:i w:val="0"/>
+          <w:iCs w:val="0"/>
+          <w:color w:val="auto"/>
+          <w:sz w:val="20"/>
+          <w:szCs w:val="20"/>
+        </w:rPr>
+        <w:t xml:space="preserve">: The Arbiter is an module that is responsible for  used for determine which device sent request to it is granted and </w:t>
+      </w:r>
+    </w:p>
+    <w:p>
+      <w:pPr>
+        <w:numPr>
+          <w:ilvl w:val="0"/>
+          <w:numId w:val="0"/>
+        </w:numPr>
+        <w:ind w:left="0" w:leftChars="0" w:firstLine="400" w:firstLineChars="200"/>
+        <w:jc w:val="both"/>
+        <w:outlineLvl w:val="0"/>
+        <w:rPr>
+          <w:rFonts w:hint="default" w:asciiTheme="majorEastAsia" w:hAnsiTheme="majorEastAsia" w:eastAsiaTheme="majorEastAsia" w:cstheme="majorEastAsia"/>
+          <w:b w:val="0"/>
+          <w:bCs w:val="0"/>
+          <w:i w:val="0"/>
+          <w:iCs w:val="0"/>
+          <w:color w:val="auto"/>
+          <w:sz w:val="20"/>
+          <w:szCs w:val="20"/>
+        </w:rPr>
+      </w:pPr>
+    </w:p>
+    <w:p>
+      <w:pPr>
+        <w:numPr>
+          <w:ilvl w:val="0"/>
+          <w:numId w:val="0"/>
+        </w:numPr>
+        <w:ind w:left="0" w:leftChars="0" w:firstLine="0" w:firstLineChars="0"/>
+        <w:jc w:val="right"/>
+        <w:outlineLvl w:val="0"/>
+        <w:rPr>
+          <w:rFonts w:hint="eastAsia" w:asciiTheme="majorEastAsia" w:hAnsiTheme="majorEastAsia" w:eastAsiaTheme="majorEastAsia" w:cstheme="majorEastAsia"/>
+          <w:b/>
+          <w:bCs/>
+          <w:i w:val="0"/>
+          <w:iCs w:val="0"/>
+          <w:color w:val="002060"/>
+          <w:sz w:val="20"/>
+          <w:szCs w:val="20"/>
+        </w:rPr>
+      </w:pPr>
+      <w:r>
+        <w:rPr>
+          <w:rFonts w:hint="eastAsia" w:asciiTheme="majorEastAsia" w:hAnsiTheme="majorEastAsia" w:eastAsiaTheme="majorEastAsia" w:cstheme="majorEastAsia"/>
+          <w:b/>
+          <w:bCs/>
+          <w:i w:val="0"/>
+          <w:iCs w:val="0"/>
+          <w:color w:val="002060"/>
+          <w:sz w:val="20"/>
+          <w:szCs w:val="20"/>
+        </w:rPr>
+        <w:drawing>
+          <wp:inline distT="0" distB="0" distL="114300" distR="114300">
+            <wp:extent cx="4798060" cy="2625725"/>
+            <wp:effectExtent l="0" t="0" r="2540" b="3175"/>
+            <wp:docPr id="4" name="Picture 4" descr="/home/long-nguyen/work/spmcu/docs/block_diagram/common/rr_arbiter/spmcu_rr_arbiter.pngspmcu_rr_arbiter"/>
+            <wp:cNvGraphicFramePr>
+              <a:graphicFrameLocks xmlns:a="http://schemas.openxmlformats.org/drawingml/2006/main" noChangeAspect="1"/>
+            </wp:cNvGraphicFramePr>
+            <a:graphic xmlns:a="http://schemas.openxmlformats.org/drawingml/2006/main">
+              <a:graphicData uri="http://schemas.openxmlformats.org/drawingml/2006/picture">
+                <pic:pic xmlns:pic="http://schemas.openxmlformats.org/drawingml/2006/picture">
+                  <pic:nvPicPr>
+                    <pic:cNvPr id="4" name="Picture 4" descr="/home/long-nguyen/work/spmcu/docs/block_diagram/common/rr_arbiter/spmcu_rr_arbiter.pngspmcu_rr_arbiter"/>
+                    <pic:cNvPicPr>
+                      <a:picLocks noChangeAspect="1"/>
+                    </pic:cNvPicPr>
+                  </pic:nvPicPr>
+                  <pic:blipFill>
+                    <a:blip r:embed="rId5"/>
+                    <a:srcRect/>
+                    <a:stretch>
+                      <a:fillRect/>
+                    </a:stretch>
+                  </pic:blipFill>
+                  <pic:spPr>
+                    <a:xfrm>
+                      <a:off x="0" y="0"/>
+                      <a:ext cx="4798060" cy="2625725"/>
+                    </a:xfrm>
+                    <a:prstGeom prst="rect">
+                      <a:avLst/>
+                    </a:prstGeom>
+                  </pic:spPr>
+                </pic:pic>
+              </a:graphicData>
+            </a:graphic>
+          </wp:inline>
+        </w:drawing>
+      </w:r>
+      <w:bookmarkStart w:id="0" w:name="_GoBack"/>
+      <w:bookmarkEnd w:id="0"/>
+    </w:p>
+    <w:p>
+      <w:pPr>
+        <w:pStyle w:val="2"/>
+        <w:numPr>
+          <w:ilvl w:val="0"/>
+          <w:numId w:val="0"/>
+        </w:numPr>
+        <w:ind w:left="0" w:leftChars="0" w:firstLine="0" w:firstLineChars="0"/>
+        <w:jc w:val="left"/>
+        <w:outlineLvl w:val="0"/>
+        <w:rPr>
+          <w:rFonts w:hint="eastAsia" w:asciiTheme="majorEastAsia" w:hAnsiTheme="majorEastAsia" w:eastAsiaTheme="majorEastAsia" w:cstheme="majorEastAsia"/>
+          <w:b/>
+          <w:bCs/>
+          <w:i w:val="0"/>
+          <w:iCs w:val="0"/>
+          <w:color w:val="002060"/>
+          <w:sz w:val="20"/>
+          <w:szCs w:val="20"/>
+        </w:rPr>
+      </w:pPr>
+      <w:r>
+        <w:rPr>
+          <w:rFonts w:hint="eastAsia" w:asciiTheme="minorEastAsia" w:hAnsiTheme="minorEastAsia" w:eastAsiaTheme="minorEastAsia" w:cstheme="minorEastAsia"/>
+          <w:color w:val="002060"/>
+        </w:rPr>
+        <w:t xml:space="preserve">Figure </w:t>
+      </w:r>
+      <w:r>
+        <w:rPr>
+          <w:rFonts w:hint="eastAsia" w:asciiTheme="minorEastAsia" w:hAnsiTheme="minorEastAsia" w:eastAsiaTheme="minorEastAsia" w:cstheme="minorEastAsia"/>
+          <w:color w:val="002060"/>
+        </w:rPr>
+        <w:fldChar w:fldCharType="begin"/>
+      </w:r>
+      <w:r>
+        <w:rPr>
+          <w:rFonts w:hint="eastAsia" w:asciiTheme="minorEastAsia" w:hAnsiTheme="minorEastAsia" w:eastAsiaTheme="minorEastAsia" w:cstheme="minorEastAsia"/>
+          <w:color w:val="002060"/>
+        </w:rPr>
+        <w:instrText xml:space="preserve"> SEQ Figure \* ARABIC </w:instrText>
+      </w:r>
+      <w:r>
+        <w:rPr>
+          <w:rFonts w:hint="eastAsia" w:asciiTheme="minorEastAsia" w:hAnsiTheme="minorEastAsia" w:eastAsiaTheme="minorEastAsia" w:cstheme="minorEastAsia"/>
+          <w:color w:val="002060"/>
+        </w:rPr>
+        <w:fldChar w:fldCharType="separate"/>
+      </w:r>
+      <w:r>
+        <w:rPr>
+          <w:rFonts w:hint="eastAsia" w:asciiTheme="minorEastAsia" w:hAnsiTheme="minorEastAsia" w:eastAsiaTheme="minorEastAsia" w:cstheme="minorEastAsia"/>
+          <w:color w:val="002060"/>
+        </w:rPr>
+        <w:t>2</w:t>
+      </w:r>
+      <w:r>
+        <w:rPr>
+          <w:rFonts w:hint="eastAsia" w:asciiTheme="minorEastAsia" w:hAnsiTheme="minorEastAsia" w:eastAsiaTheme="minorEastAsia" w:cstheme="minorEastAsia"/>
+          <w:color w:val="002060"/>
+        </w:rPr>
+        <w:fldChar w:fldCharType="end"/>
+      </w:r>
+      <w:r>
+        <w:rPr>
+          <w:rFonts w:hint="eastAsia" w:asciiTheme="minorEastAsia" w:hAnsiTheme="minorEastAsia" w:eastAsiaTheme="minorEastAsia" w:cstheme="minorEastAsia"/>
+          <w:color w:val="002060"/>
+        </w:rPr>
+        <w:t xml:space="preserve"> - Overview usage of Round Robin Arbiter</w:t>
+      </w:r>
+    </w:p>
+    <w:p>
+      <w:pPr>
+        <w:numPr>
+          <w:ilvl w:val="2"/>
+          <w:numId w:val="3"/>
+        </w:numPr>
+        <w:ind w:left="0" w:leftChars="0" w:firstLine="0" w:firstLineChars="0"/>
+        <w:jc w:val="left"/>
+        <w:outlineLvl w:val="0"/>
+        <w:rPr>
+          <w:rFonts w:hint="eastAsia" w:asciiTheme="majorEastAsia" w:hAnsiTheme="majorEastAsia" w:eastAsiaTheme="majorEastAsia" w:cstheme="majorEastAsia"/>
+          <w:b/>
+          <w:bCs/>
+          <w:i w:val="0"/>
+          <w:iCs w:val="0"/>
+          <w:color w:val="002060"/>
+          <w:sz w:val="20"/>
+          <w:szCs w:val="20"/>
+        </w:rPr>
+      </w:pPr>
+      <w:r>
+        <w:rPr>
+          <w:rFonts w:hint="default" w:asciiTheme="majorEastAsia" w:hAnsiTheme="majorEastAsia" w:eastAsiaTheme="majorEastAsia" w:cstheme="majorEastAsia"/>
+          <w:b/>
+          <w:bCs/>
+          <w:i w:val="0"/>
+          <w:iCs w:val="0"/>
+          <w:color w:val="002060"/>
+          <w:sz w:val="20"/>
+          <w:szCs w:val="20"/>
+        </w:rPr>
+        <w:t>Design Configurations</w:t>
+      </w:r>
+    </w:p>
+    <w:p>
+      <w:pPr>
+        <w:pStyle w:val="2"/>
+        <w:rPr>
+          <w:rFonts w:hint="eastAsia" w:asciiTheme="minorEastAsia" w:hAnsiTheme="minorEastAsia" w:eastAsiaTheme="minorEastAsia" w:cstheme="minorEastAsia"/>
+          <w:color w:val="002060"/>
+        </w:rPr>
+      </w:pPr>
+      <w:r>
+        <w:rPr>
+          <w:rFonts w:hint="eastAsia" w:asciiTheme="minorEastAsia" w:hAnsiTheme="minorEastAsia" w:eastAsiaTheme="minorEastAsia" w:cstheme="minorEastAsia"/>
+          <w:color w:val="002060"/>
+        </w:rPr>
+        <w:t xml:space="preserve">Table </w:t>
+      </w:r>
+      <w:r>
+        <w:rPr>
+          <w:rFonts w:hint="eastAsia" w:asciiTheme="minorEastAsia" w:hAnsiTheme="minorEastAsia" w:eastAsiaTheme="minorEastAsia" w:cstheme="minorEastAsia"/>
+          <w:color w:val="002060"/>
+        </w:rPr>
+        <w:fldChar w:fldCharType="begin"/>
+      </w:r>
+      <w:r>
+        <w:rPr>
+          <w:rFonts w:hint="eastAsia" w:asciiTheme="minorEastAsia" w:hAnsiTheme="minorEastAsia" w:eastAsiaTheme="minorEastAsia" w:cstheme="minorEastAsia"/>
+          <w:color w:val="002060"/>
+        </w:rPr>
+        <w:instrText xml:space="preserve"> SEQ Table \* ARABIC </w:instrText>
+      </w:r>
+      <w:r>
+        <w:rPr>
+          <w:rFonts w:hint="eastAsia" w:asciiTheme="minorEastAsia" w:hAnsiTheme="minorEastAsia" w:eastAsiaTheme="minorEastAsia" w:cstheme="minorEastAsia"/>
+          <w:color w:val="002060"/>
+        </w:rPr>
+        <w:fldChar w:fldCharType="separate"/>
+      </w:r>
+      <w:r>
+        <w:rPr>
+          <w:rFonts w:hint="eastAsia" w:asciiTheme="minorEastAsia" w:hAnsiTheme="minorEastAsia" w:eastAsiaTheme="minorEastAsia" w:cstheme="minorEastAsia"/>
+          <w:color w:val="002060"/>
+        </w:rPr>
+        <w:t>4</w:t>
+      </w:r>
+      <w:r>
+        <w:rPr>
+          <w:rFonts w:hint="eastAsia" w:asciiTheme="minorEastAsia" w:hAnsiTheme="minorEastAsia" w:eastAsiaTheme="minorEastAsia" w:cstheme="minorEastAsia"/>
+          <w:color w:val="002060"/>
+        </w:rPr>
+        <w:fldChar w:fldCharType="end"/>
+      </w:r>
+      <w:r>
+        <w:rPr>
+          <w:rFonts w:hint="eastAsia" w:asciiTheme="minorEastAsia" w:hAnsiTheme="minorEastAsia" w:eastAsiaTheme="minorEastAsia" w:cstheme="minorEastAsia"/>
+          <w:color w:val="002060"/>
+        </w:rPr>
+        <w:t xml:space="preserve"> - Round Robin Arbiter parameters</w:t>
+      </w:r>
+    </w:p>
+    <w:tbl>
+      <w:tblPr>
+        <w:tblStyle w:val="5"/>
+        <w:tblW w:w="8509" w:type="dxa"/>
+        <w:tblInd w:w="0" w:type="dxa"/>
+        <w:tblBorders>
+          <w:top w:val="single" w:color="auto" w:sz="4" w:space="0"/>
+          <w:left w:val="single" w:color="auto" w:sz="4" w:space="0"/>
+          <w:bottom w:val="single" w:color="auto" w:sz="4" w:space="0"/>
+          <w:right w:val="single" w:color="auto" w:sz="4" w:space="0"/>
+          <w:insideH w:val="single" w:color="auto" w:sz="4" w:space="0"/>
+          <w:insideV w:val="single" w:color="auto" w:sz="4" w:space="0"/>
+        </w:tblBorders>
+        <w:shd w:val="clear" w:color="auto" w:fill="auto"/>
+        <w:tblLayout w:type="fixed"/>
+        <w:tblCellMar>
+          <w:top w:w="0" w:type="dxa"/>
+          <w:left w:w="108" w:type="dxa"/>
+          <w:bottom w:w="0" w:type="dxa"/>
+          <w:right w:w="108" w:type="dxa"/>
+        </w:tblCellMar>
+      </w:tblPr>
+      <w:tblGrid>
+        <w:gridCol w:w="2140"/>
+        <w:gridCol w:w="6369"/>
+      </w:tblGrid>
+      <w:tr>
+        <w:tblPrEx>
+          <w:tblBorders>
+            <w:top w:val="single" w:color="auto" w:sz="4" w:space="0"/>
+            <w:left w:val="single" w:color="auto" w:sz="4" w:space="0"/>
+            <w:bottom w:val="single" w:color="auto" w:sz="4" w:space="0"/>
+            <w:right w:val="single" w:color="auto" w:sz="4" w:space="0"/>
+            <w:insideH w:val="single" w:color="auto" w:sz="4" w:space="0"/>
+            <w:insideV w:val="single" w:color="auto" w:sz="4" w:space="0"/>
+          </w:tblBorders>
+          <w:tblLayout w:type="fixed"/>
+          <w:tblCellMar>
+            <w:top w:w="0" w:type="dxa"/>
+            <w:left w:w="108" w:type="dxa"/>
+            <w:bottom w:w="0" w:type="dxa"/>
+            <w:right w:w="108" w:type="dxa"/>
+          </w:tblCellMar>
+        </w:tblPrEx>
+        <w:trPr>
+          <w:trHeight w:val="302" w:hRule="atLeast"/>
+        </w:trPr>
+        <w:tc>
+          <w:tcPr>
+            <w:tcW w:w="2140" w:type="dxa"/>
+            <w:tcBorders>
+              <w:tl2br w:val="nil"/>
+              <w:tr2bl w:val="nil"/>
+            </w:tcBorders>
+            <w:shd w:val="clear" w:color="auto" w:fill="A5A5A5" w:themeFill="accent3"/>
+            <w:vAlign w:val="center"/>
+          </w:tcPr>
+          <w:p>
+            <w:pPr>
+              <w:widowControl w:val="0"/>
+              <w:jc w:val="both"/>
+              <w:rPr>
+                <w:rFonts w:hint="eastAsia" w:asciiTheme="majorEastAsia" w:hAnsiTheme="majorEastAsia" w:eastAsiaTheme="majorEastAsia" w:cstheme="majorEastAsia"/>
+                <w:b/>
+                <w:bCs/>
+                <w:color w:val="002060"/>
+                <w:sz w:val="20"/>
+                <w:szCs w:val="20"/>
+                <w:shd w:val="clear" w:color="auto" w:fill="auto"/>
+                <w:vertAlign w:val="baseline"/>
+              </w:rPr>
+            </w:pPr>
+            <w:r>
+              <w:rPr>
+                <w:rFonts w:hint="default" w:asciiTheme="majorEastAsia" w:hAnsiTheme="majorEastAsia" w:eastAsiaTheme="majorEastAsia" w:cstheme="majorEastAsia"/>
+                <w:b/>
+                <w:bCs/>
+                <w:color w:val="002060"/>
+                <w:sz w:val="20"/>
+                <w:szCs w:val="20"/>
+                <w:shd w:val="clear" w:color="auto" w:fill="auto"/>
+                <w:vertAlign w:val="baseline"/>
+              </w:rPr>
+              <w:t>Parameter</w:t>
+            </w:r>
+          </w:p>
+        </w:tc>
+        <w:tc>
+          <w:tcPr>
+            <w:tcW w:w="6369" w:type="dxa"/>
+            <w:tcBorders>
+              <w:tl2br w:val="nil"/>
+              <w:tr2bl w:val="nil"/>
+            </w:tcBorders>
+            <w:shd w:val="clear" w:color="auto" w:fill="A5A5A5" w:themeFill="accent3"/>
+            <w:vAlign w:val="center"/>
+          </w:tcPr>
+          <w:p>
+            <w:pPr>
+              <w:widowControl w:val="0"/>
+              <w:jc w:val="both"/>
+              <w:rPr>
+                <w:rFonts w:hint="eastAsia" w:asciiTheme="majorEastAsia" w:hAnsiTheme="majorEastAsia" w:eastAsiaTheme="majorEastAsia" w:cstheme="majorEastAsia"/>
+                <w:b/>
+                <w:bCs/>
+                <w:color w:val="002060"/>
+                <w:sz w:val="20"/>
+                <w:szCs w:val="20"/>
+                <w:shd w:val="clear" w:color="auto" w:fill="auto"/>
+                <w:vertAlign w:val="baseline"/>
+              </w:rPr>
+            </w:pPr>
+            <w:r>
+              <w:rPr>
+                <w:rFonts w:hint="default" w:asciiTheme="majorEastAsia" w:hAnsiTheme="majorEastAsia" w:eastAsiaTheme="majorEastAsia" w:cstheme="majorEastAsia"/>
+                <w:b/>
+                <w:bCs/>
+                <w:color w:val="002060"/>
+                <w:sz w:val="20"/>
+                <w:szCs w:val="20"/>
+                <w:shd w:val="clear" w:color="auto" w:fill="auto"/>
+                <w:vertAlign w:val="baseline"/>
+              </w:rPr>
+              <w:t>Detail</w:t>
+            </w:r>
+          </w:p>
+        </w:tc>
+      </w:tr>
+      <w:tr>
+        <w:tblPrEx>
+          <w:tblBorders>
+            <w:top w:val="single" w:color="auto" w:sz="4" w:space="0"/>
+            <w:left w:val="single" w:color="auto" w:sz="4" w:space="0"/>
+            <w:bottom w:val="single" w:color="auto" w:sz="4" w:space="0"/>
+            <w:right w:val="single" w:color="auto" w:sz="4" w:space="0"/>
+            <w:insideH w:val="single" w:color="auto" w:sz="4" w:space="0"/>
+            <w:insideV w:val="single" w:color="auto" w:sz="4" w:space="0"/>
+          </w:tblBorders>
+          <w:tblLayout w:type="fixed"/>
+          <w:tblCellMar>
+            <w:top w:w="0" w:type="dxa"/>
+            <w:left w:w="108" w:type="dxa"/>
+            <w:bottom w:w="0" w:type="dxa"/>
+            <w:right w:w="108" w:type="dxa"/>
+          </w:tblCellMar>
+        </w:tblPrEx>
+        <w:trPr>
+          <w:trHeight w:val="302" w:hRule="atLeast"/>
+        </w:trPr>
+        <w:tc>
+          <w:tcPr>
+            <w:tcW w:w="2140" w:type="dxa"/>
+            <w:tcBorders>
+              <w:tl2br w:val="nil"/>
+              <w:tr2bl w:val="nil"/>
+            </w:tcBorders>
+            <w:shd w:val="clear" w:color="auto" w:fill="auto"/>
+            <w:vAlign w:val="top"/>
+          </w:tcPr>
+          <w:p>
+            <w:pPr>
+              <w:widowControl w:val="0"/>
+              <w:jc w:val="both"/>
+              <w:rPr>
+                <w:rFonts w:hint="eastAsia" w:asciiTheme="majorEastAsia" w:hAnsiTheme="majorEastAsia" w:eastAsiaTheme="majorEastAsia" w:cstheme="majorEastAsia"/>
+                <w:b w:val="0"/>
+                <w:bCs w:val="0"/>
+                <w:color w:val="auto"/>
+                <w:sz w:val="20"/>
+                <w:szCs w:val="20"/>
+                <w:vertAlign w:val="baseline"/>
+              </w:rPr>
+            </w:pPr>
+            <w:r>
+              <w:rPr>
+                <w:rFonts w:hint="default" w:asciiTheme="majorEastAsia" w:hAnsiTheme="majorEastAsia" w:eastAsiaTheme="majorEastAsia" w:cstheme="majorEastAsia"/>
+                <w:b w:val="0"/>
+                <w:bCs w:val="0"/>
+                <w:color w:val="auto"/>
+                <w:sz w:val="20"/>
+                <w:szCs w:val="20"/>
+                <w:vertAlign w:val="baseline"/>
+              </w:rPr>
+              <w:t>N</w:t>
+            </w:r>
+            <w:r>
+              <w:rPr>
+                <w:rFonts w:hint="default" w:asciiTheme="majorEastAsia" w:hAnsiTheme="majorEastAsia" w:eastAsiaTheme="majorEastAsia" w:cstheme="majorEastAsia"/>
+                <w:b w:val="0"/>
+                <w:bCs w:val="0"/>
+                <w:color w:val="auto"/>
+                <w:sz w:val="20"/>
+                <w:szCs w:val="20"/>
+                <w:vertAlign w:val="baseline"/>
+              </w:rPr>
+              <w:t>R</w:t>
+            </w:r>
+          </w:p>
+        </w:tc>
+        <w:tc>
+          <w:tcPr>
+            <w:tcW w:w="6369" w:type="dxa"/>
+            <w:tcBorders>
+              <w:tl2br w:val="nil"/>
+              <w:tr2bl w:val="nil"/>
+            </w:tcBorders>
+            <w:shd w:val="clear" w:color="auto" w:fill="auto"/>
+            <w:vAlign w:val="top"/>
+          </w:tcPr>
+          <w:p>
+            <w:pPr>
+              <w:widowControl w:val="0"/>
+              <w:jc w:val="both"/>
+              <w:rPr>
+                <w:rFonts w:hint="default" w:asciiTheme="majorEastAsia" w:hAnsiTheme="majorEastAsia" w:eastAsiaTheme="majorEastAsia" w:cstheme="majorEastAsia"/>
+                <w:b w:val="0"/>
+                <w:bCs w:val="0"/>
+                <w:color w:val="auto"/>
+                <w:sz w:val="20"/>
+                <w:szCs w:val="20"/>
+                <w:vertAlign w:val="baseline"/>
+              </w:rPr>
+            </w:pPr>
+            <w:r>
+              <w:rPr>
+                <w:rFonts w:hint="default" w:asciiTheme="majorEastAsia" w:hAnsiTheme="majorEastAsia" w:eastAsiaTheme="majorEastAsia" w:cstheme="majorEastAsia"/>
+                <w:b w:val="0"/>
+                <w:bCs w:val="0"/>
+                <w:color w:val="auto"/>
+                <w:sz w:val="20"/>
+                <w:szCs w:val="20"/>
+                <w:vertAlign w:val="baseline"/>
+              </w:rPr>
+              <w:t xml:space="preserve">Number of </w:t>
+            </w:r>
+            <w:r>
+              <w:rPr>
+                <w:rFonts w:hint="default" w:asciiTheme="majorEastAsia" w:hAnsiTheme="majorEastAsia" w:eastAsiaTheme="majorEastAsia" w:cstheme="majorEastAsia"/>
+                <w:b w:val="0"/>
+                <w:bCs w:val="0"/>
+                <w:color w:val="auto"/>
+                <w:sz w:val="20"/>
+                <w:szCs w:val="20"/>
+                <w:vertAlign w:val="baseline"/>
+              </w:rPr>
+              <w:t>request sent to the arbiter</w:t>
+            </w:r>
+          </w:p>
+          <w:p>
+            <w:pPr>
+              <w:widowControl w:val="0"/>
+              <w:jc w:val="both"/>
+              <w:rPr>
+                <w:rFonts w:hint="default" w:asciiTheme="majorEastAsia" w:hAnsiTheme="majorEastAsia" w:eastAsiaTheme="majorEastAsia" w:cstheme="majorEastAsia"/>
+                <w:b w:val="0"/>
+                <w:bCs w:val="0"/>
+                <w:color w:val="auto"/>
+                <w:sz w:val="20"/>
+                <w:szCs w:val="20"/>
+                <w:vertAlign w:val="baseline"/>
+              </w:rPr>
+            </w:pPr>
+            <w:r>
+              <w:rPr>
+                <w:rFonts w:hint="default" w:asciiTheme="majorEastAsia" w:hAnsiTheme="majorEastAsia" w:eastAsiaTheme="majorEastAsia" w:cstheme="majorEastAsia"/>
+                <w:b w:val="0"/>
+                <w:bCs w:val="0"/>
+                <w:color w:val="auto"/>
+                <w:sz w:val="20"/>
+                <w:szCs w:val="20"/>
+                <w:vertAlign w:val="baseline"/>
+              </w:rPr>
+              <w:t>- Default value = 4</w:t>
+            </w:r>
+          </w:p>
+          <w:p>
+            <w:pPr>
+              <w:widowControl w:val="0"/>
+              <w:jc w:val="both"/>
+              <w:rPr>
+                <w:rFonts w:hint="eastAsia" w:asciiTheme="majorEastAsia" w:hAnsiTheme="majorEastAsia" w:eastAsiaTheme="majorEastAsia" w:cstheme="majorEastAsia"/>
+                <w:b w:val="0"/>
+                <w:bCs w:val="0"/>
+                <w:color w:val="auto"/>
+                <w:sz w:val="20"/>
+                <w:szCs w:val="20"/>
+                <w:vertAlign w:val="baseline"/>
+              </w:rPr>
+            </w:pPr>
+            <w:r>
+              <w:rPr>
+                <w:rFonts w:hint="default" w:asciiTheme="majorEastAsia" w:hAnsiTheme="majorEastAsia" w:eastAsiaTheme="majorEastAsia" w:cstheme="majorEastAsia"/>
+                <w:b w:val="0"/>
+                <w:bCs w:val="0"/>
+                <w:color w:val="auto"/>
+                <w:sz w:val="20"/>
+                <w:szCs w:val="20"/>
+                <w:vertAlign w:val="baseline"/>
+              </w:rPr>
+              <w:t>- Legal value: N</w:t>
+            </w:r>
+            <w:r>
+              <w:rPr>
+                <w:rFonts w:hint="default" w:asciiTheme="majorEastAsia" w:hAnsiTheme="majorEastAsia" w:eastAsiaTheme="majorEastAsia" w:cstheme="majorEastAsia"/>
+                <w:b w:val="0"/>
+                <w:bCs w:val="0"/>
+                <w:color w:val="auto"/>
+                <w:sz w:val="20"/>
+                <w:szCs w:val="20"/>
+                <w:vertAlign w:val="baseline"/>
+              </w:rPr>
+              <w:t>R</w:t>
+            </w:r>
+            <w:r>
+              <w:rPr>
+                <w:rFonts w:hint="default" w:asciiTheme="majorEastAsia" w:hAnsiTheme="majorEastAsia" w:eastAsiaTheme="majorEastAsia" w:cstheme="majorEastAsia"/>
+                <w:b w:val="0"/>
+                <w:bCs w:val="0"/>
+                <w:color w:val="auto"/>
+                <w:sz w:val="20"/>
+                <w:szCs w:val="20"/>
+                <w:vertAlign w:val="baseline"/>
+              </w:rPr>
+              <w:t xml:space="preserve"> &gt; </w:t>
+            </w:r>
+            <w:r>
+              <w:rPr>
+                <w:rFonts w:hint="default" w:asciiTheme="majorEastAsia" w:hAnsiTheme="majorEastAsia" w:eastAsiaTheme="majorEastAsia" w:cstheme="majorEastAsia"/>
+                <w:b w:val="0"/>
+                <w:bCs w:val="0"/>
+                <w:color w:val="auto"/>
+                <w:sz w:val="20"/>
+                <w:szCs w:val="20"/>
+                <w:vertAlign w:val="baseline"/>
+              </w:rPr>
+              <w:t>1</w:t>
             </w:r>
           </w:p>
         </w:tc>
@@ -5370,7 +5975,28 @@
         <w:numPr>
           <w:numId w:val="0"/>
         </w:numPr>
-        <w:ind w:left="0" w:leftChars="0" w:firstLine="402" w:firstLineChars="200"/>
+        <w:ind w:left="0" w:leftChars="0" w:firstLine="400" w:firstLineChars="200"/>
+        <w:jc w:val="left"/>
+        <w:outlineLvl w:val="0"/>
+        <w:rPr>
+          <w:rFonts w:hint="eastAsia" w:asciiTheme="majorEastAsia" w:hAnsiTheme="majorEastAsia" w:eastAsiaTheme="majorEastAsia" w:cstheme="majorEastAsia"/>
+          <w:b w:val="0"/>
+          <w:bCs w:val="0"/>
+          <w:i w:val="0"/>
+          <w:iCs w:val="0"/>
+          <w:color w:val="auto"/>
+          <w:sz w:val="20"/>
+          <w:szCs w:val="20"/>
+        </w:rPr>
+      </w:pPr>
+    </w:p>
+    <w:p>
+      <w:pPr>
+        <w:numPr>
+          <w:ilvl w:val="2"/>
+          <w:numId w:val="3"/>
+        </w:numPr>
+        <w:ind w:left="0" w:leftChars="0" w:firstLine="0" w:firstLineChars="0"/>
         <w:jc w:val="left"/>
         <w:outlineLvl w:val="0"/>
         <w:rPr>
@@ -5384,6 +6010,1329 @@
           <w:szCs w:val="20"/>
         </w:rPr>
       </w:pPr>
+      <w:r>
+        <w:rPr>
+          <w:rFonts w:hint="default" w:asciiTheme="majorEastAsia" w:hAnsiTheme="majorEastAsia" w:eastAsiaTheme="majorEastAsia" w:cstheme="majorEastAsia"/>
+          <w:b/>
+          <w:bCs/>
+          <w:i w:val="0"/>
+          <w:iCs w:val="0"/>
+          <w:color w:val="002060"/>
+          <w:sz w:val="20"/>
+          <w:szCs w:val="20"/>
+        </w:rPr>
+        <w:t>Port List</w:t>
+      </w:r>
+    </w:p>
+    <w:p>
+      <w:pPr>
+        <w:pStyle w:val="2"/>
+        <w:rPr>
+          <w:rFonts w:hint="eastAsia" w:asciiTheme="minorEastAsia" w:hAnsiTheme="minorEastAsia" w:eastAsiaTheme="minorEastAsia" w:cstheme="minorEastAsia"/>
+          <w:color w:val="002060"/>
+        </w:rPr>
+      </w:pPr>
+      <w:r>
+        <w:rPr>
+          <w:rFonts w:hint="eastAsia" w:asciiTheme="minorEastAsia" w:hAnsiTheme="minorEastAsia" w:eastAsiaTheme="minorEastAsia" w:cstheme="minorEastAsia"/>
+          <w:color w:val="002060"/>
+        </w:rPr>
+        <w:t xml:space="preserve">Table </w:t>
+      </w:r>
+      <w:r>
+        <w:rPr>
+          <w:rFonts w:hint="eastAsia" w:asciiTheme="minorEastAsia" w:hAnsiTheme="minorEastAsia" w:eastAsiaTheme="minorEastAsia" w:cstheme="minorEastAsia"/>
+          <w:color w:val="002060"/>
+        </w:rPr>
+        <w:fldChar w:fldCharType="begin"/>
+      </w:r>
+      <w:r>
+        <w:rPr>
+          <w:rFonts w:hint="eastAsia" w:asciiTheme="minorEastAsia" w:hAnsiTheme="minorEastAsia" w:eastAsiaTheme="minorEastAsia" w:cstheme="minorEastAsia"/>
+          <w:color w:val="002060"/>
+        </w:rPr>
+        <w:instrText xml:space="preserve"> SEQ Table \* ARABIC </w:instrText>
+      </w:r>
+      <w:r>
+        <w:rPr>
+          <w:rFonts w:hint="eastAsia" w:asciiTheme="minorEastAsia" w:hAnsiTheme="minorEastAsia" w:eastAsiaTheme="minorEastAsia" w:cstheme="minorEastAsia"/>
+          <w:color w:val="002060"/>
+        </w:rPr>
+        <w:fldChar w:fldCharType="separate"/>
+      </w:r>
+      <w:r>
+        <w:rPr>
+          <w:rFonts w:hint="eastAsia" w:asciiTheme="minorEastAsia" w:hAnsiTheme="minorEastAsia" w:eastAsiaTheme="minorEastAsia" w:cstheme="minorEastAsia"/>
+          <w:color w:val="002060"/>
+        </w:rPr>
+        <w:t>5</w:t>
+      </w:r>
+      <w:r>
+        <w:rPr>
+          <w:rFonts w:hint="eastAsia" w:asciiTheme="minorEastAsia" w:hAnsiTheme="minorEastAsia" w:eastAsiaTheme="minorEastAsia" w:cstheme="minorEastAsia"/>
+          <w:color w:val="002060"/>
+        </w:rPr>
+        <w:fldChar w:fldCharType="end"/>
+      </w:r>
+      <w:r>
+        <w:rPr>
+          <w:rFonts w:hint="eastAsia" w:asciiTheme="minorEastAsia" w:hAnsiTheme="minorEastAsia" w:eastAsiaTheme="minorEastAsia" w:cstheme="minorEastAsia"/>
+          <w:color w:val="002060"/>
+        </w:rPr>
+        <w:t xml:space="preserve"> - Port list of Round Robin Arbiter</w:t>
+      </w:r>
+    </w:p>
+    <w:tbl>
+      <w:tblPr>
+        <w:tblStyle w:val="5"/>
+        <w:tblW w:w="8522" w:type="dxa"/>
+        <w:tblInd w:w="0" w:type="dxa"/>
+        <w:tblBorders>
+          <w:top w:val="single" w:color="auto" w:sz="4" w:space="0"/>
+          <w:left w:val="single" w:color="auto" w:sz="4" w:space="0"/>
+          <w:bottom w:val="single" w:color="auto" w:sz="4" w:space="0"/>
+          <w:right w:val="single" w:color="auto" w:sz="4" w:space="0"/>
+          <w:insideH w:val="single" w:color="auto" w:sz="4" w:space="0"/>
+          <w:insideV w:val="single" w:color="auto" w:sz="4" w:space="0"/>
+        </w:tblBorders>
+        <w:shd w:val="clear" w:color="auto" w:fill="auto"/>
+        <w:tblLayout w:type="fixed"/>
+        <w:tblCellMar>
+          <w:top w:w="0" w:type="dxa"/>
+          <w:left w:w="108" w:type="dxa"/>
+          <w:bottom w:w="0" w:type="dxa"/>
+          <w:right w:w="108" w:type="dxa"/>
+        </w:tblCellMar>
+      </w:tblPr>
+      <w:tblGrid>
+        <w:gridCol w:w="2319"/>
+        <w:gridCol w:w="840"/>
+        <w:gridCol w:w="1368"/>
+        <w:gridCol w:w="3995"/>
+      </w:tblGrid>
+      <w:tr>
+        <w:tblPrEx>
+          <w:tblBorders>
+            <w:top w:val="single" w:color="auto" w:sz="4" w:space="0"/>
+            <w:left w:val="single" w:color="auto" w:sz="4" w:space="0"/>
+            <w:bottom w:val="single" w:color="auto" w:sz="4" w:space="0"/>
+            <w:right w:val="single" w:color="auto" w:sz="4" w:space="0"/>
+            <w:insideH w:val="single" w:color="auto" w:sz="4" w:space="0"/>
+            <w:insideV w:val="single" w:color="auto" w:sz="4" w:space="0"/>
+          </w:tblBorders>
+          <w:shd w:val="clear" w:color="auto" w:fill="auto"/>
+          <w:tblLayout w:type="fixed"/>
+          <w:tblCellMar>
+            <w:top w:w="0" w:type="dxa"/>
+            <w:left w:w="108" w:type="dxa"/>
+            <w:bottom w:w="0" w:type="dxa"/>
+            <w:right w:w="108" w:type="dxa"/>
+          </w:tblCellMar>
+        </w:tblPrEx>
+        <w:trPr>
+          <w:trHeight w:val="302" w:hRule="atLeast"/>
+        </w:trPr>
+        <w:tc>
+          <w:tcPr>
+            <w:tcW w:w="2319" w:type="dxa"/>
+            <w:tcBorders>
+              <w:tl2br w:val="nil"/>
+              <w:tr2bl w:val="nil"/>
+            </w:tcBorders>
+            <w:shd w:val="clear" w:color="auto" w:fill="A5A5A5" w:themeFill="accent3"/>
+            <w:vAlign w:val="center"/>
+          </w:tcPr>
+          <w:p>
+            <w:pPr>
+              <w:widowControl w:val="0"/>
+              <w:jc w:val="both"/>
+              <w:rPr>
+                <w:rFonts w:hint="eastAsia" w:asciiTheme="majorEastAsia" w:hAnsiTheme="majorEastAsia" w:eastAsiaTheme="majorEastAsia" w:cstheme="majorEastAsia"/>
+                <w:b/>
+                <w:bCs/>
+                <w:color w:val="002060"/>
+                <w:sz w:val="20"/>
+                <w:szCs w:val="20"/>
+                <w:shd w:val="clear" w:color="auto" w:fill="auto"/>
+                <w:vertAlign w:val="baseline"/>
+              </w:rPr>
+            </w:pPr>
+            <w:r>
+              <w:rPr>
+                <w:rFonts w:hint="default" w:asciiTheme="majorEastAsia" w:hAnsiTheme="majorEastAsia" w:eastAsiaTheme="majorEastAsia" w:cstheme="majorEastAsia"/>
+                <w:b/>
+                <w:bCs/>
+                <w:color w:val="002060"/>
+                <w:sz w:val="20"/>
+                <w:szCs w:val="20"/>
+                <w:shd w:val="clear" w:color="auto" w:fill="auto"/>
+                <w:vertAlign w:val="baseline"/>
+              </w:rPr>
+              <w:t>Port name</w:t>
+            </w:r>
+          </w:p>
+        </w:tc>
+        <w:tc>
+          <w:tcPr>
+            <w:tcW w:w="840" w:type="dxa"/>
+            <w:tcBorders>
+              <w:tl2br w:val="nil"/>
+              <w:tr2bl w:val="nil"/>
+            </w:tcBorders>
+            <w:shd w:val="clear" w:color="auto" w:fill="A5A5A5" w:themeFill="accent3"/>
+            <w:vAlign w:val="center"/>
+          </w:tcPr>
+          <w:p>
+            <w:pPr>
+              <w:widowControl w:val="0"/>
+              <w:jc w:val="both"/>
+              <w:rPr>
+                <w:rFonts w:hint="default" w:asciiTheme="majorEastAsia" w:hAnsiTheme="majorEastAsia" w:eastAsiaTheme="majorEastAsia" w:cstheme="majorEastAsia"/>
+                <w:b/>
+                <w:bCs/>
+                <w:color w:val="002060"/>
+                <w:sz w:val="20"/>
+                <w:szCs w:val="20"/>
+                <w:shd w:val="clear" w:color="auto" w:fill="auto"/>
+                <w:vertAlign w:val="baseline"/>
+              </w:rPr>
+            </w:pPr>
+            <w:r>
+              <w:rPr>
+                <w:rFonts w:hint="default" w:asciiTheme="majorEastAsia" w:hAnsiTheme="majorEastAsia" w:eastAsiaTheme="majorEastAsia" w:cstheme="majorEastAsia"/>
+                <w:b/>
+                <w:bCs/>
+                <w:color w:val="002060"/>
+                <w:sz w:val="20"/>
+                <w:szCs w:val="20"/>
+                <w:shd w:val="clear" w:color="auto" w:fill="auto"/>
+                <w:vertAlign w:val="baseline"/>
+              </w:rPr>
+              <w:t>I/O</w:t>
+            </w:r>
+          </w:p>
+        </w:tc>
+        <w:tc>
+          <w:tcPr>
+            <w:tcW w:w="1368" w:type="dxa"/>
+            <w:tcBorders>
+              <w:tl2br w:val="nil"/>
+              <w:tr2bl w:val="nil"/>
+            </w:tcBorders>
+            <w:shd w:val="clear" w:color="auto" w:fill="A5A5A5" w:themeFill="accent3"/>
+            <w:vAlign w:val="center"/>
+          </w:tcPr>
+          <w:p>
+            <w:pPr>
+              <w:widowControl w:val="0"/>
+              <w:jc w:val="both"/>
+              <w:rPr>
+                <w:rFonts w:hint="default" w:asciiTheme="majorEastAsia" w:hAnsiTheme="majorEastAsia" w:eastAsiaTheme="majorEastAsia" w:cstheme="majorEastAsia"/>
+                <w:b/>
+                <w:bCs/>
+                <w:color w:val="002060"/>
+                <w:sz w:val="20"/>
+                <w:szCs w:val="20"/>
+                <w:shd w:val="clear" w:color="auto" w:fill="auto"/>
+                <w:vertAlign w:val="baseline"/>
+              </w:rPr>
+            </w:pPr>
+            <w:r>
+              <w:rPr>
+                <w:rFonts w:hint="default" w:asciiTheme="majorEastAsia" w:hAnsiTheme="majorEastAsia" w:eastAsiaTheme="majorEastAsia" w:cstheme="majorEastAsia"/>
+                <w:b/>
+                <w:bCs/>
+                <w:color w:val="002060"/>
+                <w:sz w:val="20"/>
+                <w:szCs w:val="20"/>
+                <w:shd w:val="clear" w:color="auto" w:fill="auto"/>
+                <w:vertAlign w:val="baseline"/>
+              </w:rPr>
+              <w:t>Width</w:t>
+            </w:r>
+          </w:p>
+        </w:tc>
+        <w:tc>
+          <w:tcPr>
+            <w:tcW w:w="3995" w:type="dxa"/>
+            <w:tcBorders>
+              <w:tl2br w:val="nil"/>
+              <w:tr2bl w:val="nil"/>
+            </w:tcBorders>
+            <w:shd w:val="clear" w:color="auto" w:fill="A5A5A5" w:themeFill="accent3"/>
+            <w:vAlign w:val="center"/>
+          </w:tcPr>
+          <w:p>
+            <w:pPr>
+              <w:widowControl w:val="0"/>
+              <w:jc w:val="both"/>
+              <w:rPr>
+                <w:rFonts w:hint="default" w:asciiTheme="majorEastAsia" w:hAnsiTheme="majorEastAsia" w:eastAsiaTheme="majorEastAsia" w:cstheme="majorEastAsia"/>
+                <w:b/>
+                <w:bCs/>
+                <w:color w:val="002060"/>
+                <w:sz w:val="20"/>
+                <w:szCs w:val="20"/>
+                <w:shd w:val="clear" w:color="auto" w:fill="auto"/>
+                <w:vertAlign w:val="baseline"/>
+              </w:rPr>
+            </w:pPr>
+            <w:r>
+              <w:rPr>
+                <w:rFonts w:hint="default" w:asciiTheme="majorEastAsia" w:hAnsiTheme="majorEastAsia" w:eastAsiaTheme="majorEastAsia" w:cstheme="majorEastAsia"/>
+                <w:b/>
+                <w:bCs/>
+                <w:color w:val="002060"/>
+                <w:sz w:val="20"/>
+                <w:szCs w:val="20"/>
+                <w:shd w:val="clear" w:color="auto" w:fill="auto"/>
+                <w:vertAlign w:val="baseline"/>
+              </w:rPr>
+              <w:t>Detail</w:t>
+            </w:r>
+          </w:p>
+        </w:tc>
+      </w:tr>
+      <w:tr>
+        <w:tblPrEx>
+          <w:tblBorders>
+            <w:top w:val="single" w:color="auto" w:sz="4" w:space="0"/>
+            <w:left w:val="single" w:color="auto" w:sz="4" w:space="0"/>
+            <w:bottom w:val="single" w:color="auto" w:sz="4" w:space="0"/>
+            <w:right w:val="single" w:color="auto" w:sz="4" w:space="0"/>
+            <w:insideH w:val="single" w:color="auto" w:sz="4" w:space="0"/>
+            <w:insideV w:val="single" w:color="auto" w:sz="4" w:space="0"/>
+          </w:tblBorders>
+          <w:shd w:val="clear" w:color="auto" w:fill="auto"/>
+          <w:tblLayout w:type="fixed"/>
+          <w:tblCellMar>
+            <w:top w:w="0" w:type="dxa"/>
+            <w:left w:w="108" w:type="dxa"/>
+            <w:bottom w:w="0" w:type="dxa"/>
+            <w:right w:w="108" w:type="dxa"/>
+          </w:tblCellMar>
+        </w:tblPrEx>
+        <w:trPr>
+          <w:trHeight w:val="302" w:hRule="atLeast"/>
+        </w:trPr>
+        <w:tc>
+          <w:tcPr>
+            <w:tcW w:w="2319" w:type="dxa"/>
+            <w:tcBorders>
+              <w:tl2br w:val="nil"/>
+              <w:tr2bl w:val="nil"/>
+            </w:tcBorders>
+            <w:shd w:val="clear" w:color="auto" w:fill="FFFFFF" w:themeFill="background1"/>
+            <w:textDirection w:val="lrTbV"/>
+            <w:vAlign w:val="center"/>
+          </w:tcPr>
+          <w:p>
+            <w:pPr>
+              <w:widowControl w:val="0"/>
+              <w:jc w:val="both"/>
+              <w:rPr>
+                <w:rFonts w:hint="default" w:asciiTheme="majorEastAsia" w:hAnsiTheme="majorEastAsia" w:eastAsiaTheme="majorEastAsia" w:cstheme="majorEastAsia"/>
+                <w:b w:val="0"/>
+                <w:bCs w:val="0"/>
+                <w:color w:val="auto"/>
+                <w:sz w:val="20"/>
+                <w:szCs w:val="20"/>
+                <w:vertAlign w:val="baseline"/>
+              </w:rPr>
+            </w:pPr>
+            <w:r>
+              <w:rPr>
+                <w:rFonts w:hint="default" w:asciiTheme="majorEastAsia" w:hAnsiTheme="majorEastAsia" w:eastAsiaTheme="majorEastAsia" w:cstheme="majorEastAsia"/>
+                <w:b w:val="0"/>
+                <w:bCs w:val="0"/>
+                <w:color w:val="auto"/>
+                <w:sz w:val="20"/>
+                <w:szCs w:val="20"/>
+                <w:vertAlign w:val="baseline"/>
+              </w:rPr>
+              <w:t>rstn</w:t>
+            </w:r>
+          </w:p>
+        </w:tc>
+        <w:tc>
+          <w:tcPr>
+            <w:tcW w:w="840" w:type="dxa"/>
+            <w:tcBorders>
+              <w:tl2br w:val="nil"/>
+              <w:tr2bl w:val="nil"/>
+            </w:tcBorders>
+            <w:shd w:val="clear" w:color="auto" w:fill="FFFFFF" w:themeFill="background1"/>
+            <w:textDirection w:val="lrTbV"/>
+            <w:vAlign w:val="center"/>
+          </w:tcPr>
+          <w:p>
+            <w:pPr>
+              <w:widowControl w:val="0"/>
+              <w:jc w:val="both"/>
+              <w:rPr>
+                <w:rFonts w:hint="default" w:asciiTheme="majorEastAsia" w:hAnsiTheme="majorEastAsia" w:eastAsiaTheme="majorEastAsia" w:cstheme="majorEastAsia"/>
+                <w:b w:val="0"/>
+                <w:bCs w:val="0"/>
+                <w:color w:val="auto"/>
+                <w:sz w:val="20"/>
+                <w:szCs w:val="20"/>
+                <w:vertAlign w:val="baseline"/>
+              </w:rPr>
+            </w:pPr>
+            <w:r>
+              <w:rPr>
+                <w:rFonts w:hint="default" w:asciiTheme="majorEastAsia" w:hAnsiTheme="majorEastAsia" w:eastAsiaTheme="majorEastAsia" w:cstheme="majorEastAsia"/>
+                <w:b w:val="0"/>
+                <w:bCs w:val="0"/>
+                <w:color w:val="auto"/>
+                <w:sz w:val="20"/>
+                <w:szCs w:val="20"/>
+                <w:vertAlign w:val="baseline"/>
+              </w:rPr>
+              <w:t>Input</w:t>
+            </w:r>
+          </w:p>
+        </w:tc>
+        <w:tc>
+          <w:tcPr>
+            <w:tcW w:w="1368" w:type="dxa"/>
+            <w:tcBorders>
+              <w:tl2br w:val="nil"/>
+              <w:tr2bl w:val="nil"/>
+            </w:tcBorders>
+            <w:shd w:val="clear" w:color="auto" w:fill="FFFFFF" w:themeFill="background1"/>
+            <w:textDirection w:val="lrTbV"/>
+            <w:vAlign w:val="center"/>
+          </w:tcPr>
+          <w:p>
+            <w:pPr>
+              <w:widowControl w:val="0"/>
+              <w:jc w:val="both"/>
+              <w:rPr>
+                <w:rFonts w:hint="default" w:asciiTheme="majorEastAsia" w:hAnsiTheme="majorEastAsia" w:eastAsiaTheme="majorEastAsia" w:cstheme="majorEastAsia"/>
+                <w:b w:val="0"/>
+                <w:bCs w:val="0"/>
+                <w:color w:val="auto"/>
+                <w:sz w:val="20"/>
+                <w:szCs w:val="20"/>
+                <w:vertAlign w:val="baseline"/>
+              </w:rPr>
+            </w:pPr>
+            <w:r>
+              <w:rPr>
+                <w:rFonts w:hint="default" w:asciiTheme="majorEastAsia" w:hAnsiTheme="majorEastAsia" w:eastAsiaTheme="majorEastAsia" w:cstheme="majorEastAsia"/>
+                <w:b w:val="0"/>
+                <w:bCs w:val="0"/>
+                <w:color w:val="auto"/>
+                <w:sz w:val="20"/>
+                <w:szCs w:val="20"/>
+                <w:vertAlign w:val="baseline"/>
+              </w:rPr>
+              <w:t>1</w:t>
+            </w:r>
+          </w:p>
+        </w:tc>
+        <w:tc>
+          <w:tcPr>
+            <w:tcW w:w="3995" w:type="dxa"/>
+            <w:tcBorders>
+              <w:tl2br w:val="nil"/>
+              <w:tr2bl w:val="nil"/>
+            </w:tcBorders>
+            <w:shd w:val="clear" w:color="auto" w:fill="FFFFFF" w:themeFill="background1"/>
+            <w:textDirection w:val="lrTbV"/>
+            <w:vAlign w:val="center"/>
+          </w:tcPr>
+          <w:p>
+            <w:pPr>
+              <w:widowControl w:val="0"/>
+              <w:jc w:val="both"/>
+              <w:rPr>
+                <w:rFonts w:hint="default" w:asciiTheme="majorEastAsia" w:hAnsiTheme="majorEastAsia" w:eastAsiaTheme="majorEastAsia" w:cstheme="majorEastAsia"/>
+                <w:b w:val="0"/>
+                <w:bCs w:val="0"/>
+                <w:color w:val="auto"/>
+                <w:sz w:val="20"/>
+                <w:szCs w:val="20"/>
+                <w:vertAlign w:val="baseline"/>
+              </w:rPr>
+            </w:pPr>
+            <w:r>
+              <w:rPr>
+                <w:rFonts w:hint="default" w:asciiTheme="majorEastAsia" w:hAnsiTheme="majorEastAsia" w:eastAsiaTheme="majorEastAsia" w:cstheme="majorEastAsia"/>
+                <w:b w:val="0"/>
+                <w:bCs w:val="0"/>
+                <w:color w:val="auto"/>
+                <w:sz w:val="20"/>
+                <w:szCs w:val="20"/>
+                <w:vertAlign w:val="baseline"/>
+              </w:rPr>
+              <w:t>Asynchronous reset, active low</w:t>
+            </w:r>
+          </w:p>
+        </w:tc>
+      </w:tr>
+      <w:tr>
+        <w:tblPrEx>
+          <w:tblBorders>
+            <w:top w:val="single" w:color="auto" w:sz="4" w:space="0"/>
+            <w:left w:val="single" w:color="auto" w:sz="4" w:space="0"/>
+            <w:bottom w:val="single" w:color="auto" w:sz="4" w:space="0"/>
+            <w:right w:val="single" w:color="auto" w:sz="4" w:space="0"/>
+            <w:insideH w:val="single" w:color="auto" w:sz="4" w:space="0"/>
+            <w:insideV w:val="single" w:color="auto" w:sz="4" w:space="0"/>
+          </w:tblBorders>
+          <w:shd w:val="clear" w:color="auto" w:fill="auto"/>
+          <w:tblLayout w:type="fixed"/>
+          <w:tblCellMar>
+            <w:top w:w="0" w:type="dxa"/>
+            <w:left w:w="108" w:type="dxa"/>
+            <w:bottom w:w="0" w:type="dxa"/>
+            <w:right w:w="108" w:type="dxa"/>
+          </w:tblCellMar>
+        </w:tblPrEx>
+        <w:trPr>
+          <w:trHeight w:val="302" w:hRule="atLeast"/>
+        </w:trPr>
+        <w:tc>
+          <w:tcPr>
+            <w:tcW w:w="2319" w:type="dxa"/>
+            <w:tcBorders>
+              <w:tl2br w:val="nil"/>
+              <w:tr2bl w:val="nil"/>
+            </w:tcBorders>
+            <w:shd w:val="clear" w:color="auto" w:fill="FFFFFF" w:themeFill="background1"/>
+            <w:textDirection w:val="lrTbV"/>
+            <w:vAlign w:val="center"/>
+          </w:tcPr>
+          <w:p>
+            <w:pPr>
+              <w:widowControl w:val="0"/>
+              <w:jc w:val="both"/>
+              <w:rPr>
+                <w:rFonts w:hint="default" w:asciiTheme="majorEastAsia" w:hAnsiTheme="majorEastAsia" w:eastAsiaTheme="majorEastAsia" w:cstheme="majorEastAsia"/>
+                <w:b w:val="0"/>
+                <w:bCs w:val="0"/>
+                <w:color w:val="auto"/>
+                <w:sz w:val="20"/>
+                <w:szCs w:val="20"/>
+                <w:vertAlign w:val="baseline"/>
+              </w:rPr>
+            </w:pPr>
+            <w:r>
+              <w:rPr>
+                <w:rFonts w:hint="default" w:asciiTheme="majorEastAsia" w:hAnsiTheme="majorEastAsia" w:eastAsiaTheme="majorEastAsia" w:cstheme="majorEastAsia"/>
+                <w:b w:val="0"/>
+                <w:bCs w:val="0"/>
+                <w:color w:val="auto"/>
+                <w:sz w:val="20"/>
+                <w:szCs w:val="20"/>
+                <w:vertAlign w:val="baseline"/>
+              </w:rPr>
+              <w:t>clk</w:t>
+            </w:r>
+          </w:p>
+        </w:tc>
+        <w:tc>
+          <w:tcPr>
+            <w:tcW w:w="840" w:type="dxa"/>
+            <w:tcBorders>
+              <w:tl2br w:val="nil"/>
+              <w:tr2bl w:val="nil"/>
+            </w:tcBorders>
+            <w:shd w:val="clear" w:color="auto" w:fill="FFFFFF" w:themeFill="background1"/>
+            <w:textDirection w:val="lrTbV"/>
+            <w:vAlign w:val="center"/>
+          </w:tcPr>
+          <w:p>
+            <w:pPr>
+              <w:widowControl w:val="0"/>
+              <w:jc w:val="both"/>
+              <w:rPr>
+                <w:rFonts w:hint="default" w:asciiTheme="majorEastAsia" w:hAnsiTheme="majorEastAsia" w:eastAsiaTheme="majorEastAsia" w:cstheme="majorEastAsia"/>
+                <w:b w:val="0"/>
+                <w:bCs w:val="0"/>
+                <w:color w:val="auto"/>
+                <w:sz w:val="20"/>
+                <w:szCs w:val="20"/>
+                <w:vertAlign w:val="baseline"/>
+              </w:rPr>
+            </w:pPr>
+            <w:r>
+              <w:rPr>
+                <w:rFonts w:hint="default" w:asciiTheme="majorEastAsia" w:hAnsiTheme="majorEastAsia" w:eastAsiaTheme="majorEastAsia" w:cstheme="majorEastAsia"/>
+                <w:b w:val="0"/>
+                <w:bCs w:val="0"/>
+                <w:color w:val="auto"/>
+                <w:sz w:val="20"/>
+                <w:szCs w:val="20"/>
+                <w:vertAlign w:val="baseline"/>
+              </w:rPr>
+              <w:t>Input</w:t>
+            </w:r>
+          </w:p>
+        </w:tc>
+        <w:tc>
+          <w:tcPr>
+            <w:tcW w:w="1368" w:type="dxa"/>
+            <w:tcBorders>
+              <w:tl2br w:val="nil"/>
+              <w:tr2bl w:val="nil"/>
+            </w:tcBorders>
+            <w:shd w:val="clear" w:color="auto" w:fill="FFFFFF" w:themeFill="background1"/>
+            <w:textDirection w:val="lrTbV"/>
+            <w:vAlign w:val="center"/>
+          </w:tcPr>
+          <w:p>
+            <w:pPr>
+              <w:widowControl w:val="0"/>
+              <w:jc w:val="both"/>
+              <w:rPr>
+                <w:rFonts w:hint="default" w:asciiTheme="majorEastAsia" w:hAnsiTheme="majorEastAsia" w:eastAsiaTheme="majorEastAsia" w:cstheme="majorEastAsia"/>
+                <w:b w:val="0"/>
+                <w:bCs w:val="0"/>
+                <w:color w:val="auto"/>
+                <w:sz w:val="20"/>
+                <w:szCs w:val="20"/>
+                <w:vertAlign w:val="baseline"/>
+              </w:rPr>
+            </w:pPr>
+            <w:r>
+              <w:rPr>
+                <w:rFonts w:hint="default" w:asciiTheme="majorEastAsia" w:hAnsiTheme="majorEastAsia" w:eastAsiaTheme="majorEastAsia" w:cstheme="majorEastAsia"/>
+                <w:b w:val="0"/>
+                <w:bCs w:val="0"/>
+                <w:color w:val="auto"/>
+                <w:sz w:val="20"/>
+                <w:szCs w:val="20"/>
+                <w:vertAlign w:val="baseline"/>
+              </w:rPr>
+              <w:t>1</w:t>
+            </w:r>
+          </w:p>
+        </w:tc>
+        <w:tc>
+          <w:tcPr>
+            <w:tcW w:w="3995" w:type="dxa"/>
+            <w:tcBorders>
+              <w:tl2br w:val="nil"/>
+              <w:tr2bl w:val="nil"/>
+            </w:tcBorders>
+            <w:shd w:val="clear" w:color="auto" w:fill="FFFFFF" w:themeFill="background1"/>
+            <w:textDirection w:val="lrTbV"/>
+            <w:vAlign w:val="center"/>
+          </w:tcPr>
+          <w:p>
+            <w:pPr>
+              <w:widowControl w:val="0"/>
+              <w:jc w:val="both"/>
+              <w:rPr>
+                <w:rFonts w:hint="default" w:asciiTheme="majorEastAsia" w:hAnsiTheme="majorEastAsia" w:eastAsiaTheme="majorEastAsia" w:cstheme="majorEastAsia"/>
+                <w:b w:val="0"/>
+                <w:bCs w:val="0"/>
+                <w:color w:val="auto"/>
+                <w:sz w:val="20"/>
+                <w:szCs w:val="20"/>
+                <w:vertAlign w:val="baseline"/>
+              </w:rPr>
+            </w:pPr>
+            <w:r>
+              <w:rPr>
+                <w:rFonts w:hint="default" w:asciiTheme="majorEastAsia" w:hAnsiTheme="majorEastAsia" w:eastAsiaTheme="majorEastAsia" w:cstheme="majorEastAsia"/>
+                <w:b w:val="0"/>
+                <w:bCs w:val="0"/>
+                <w:color w:val="auto"/>
+                <w:sz w:val="20"/>
+                <w:szCs w:val="20"/>
+                <w:vertAlign w:val="baseline"/>
+              </w:rPr>
+              <w:t>Clock</w:t>
+            </w:r>
+          </w:p>
+        </w:tc>
+      </w:tr>
+      <w:tr>
+        <w:tblPrEx>
+          <w:tblBorders>
+            <w:top w:val="single" w:color="auto" w:sz="4" w:space="0"/>
+            <w:left w:val="single" w:color="auto" w:sz="4" w:space="0"/>
+            <w:bottom w:val="single" w:color="auto" w:sz="4" w:space="0"/>
+            <w:right w:val="single" w:color="auto" w:sz="4" w:space="0"/>
+            <w:insideH w:val="single" w:color="auto" w:sz="4" w:space="0"/>
+            <w:insideV w:val="single" w:color="auto" w:sz="4" w:space="0"/>
+          </w:tblBorders>
+          <w:shd w:val="clear" w:color="auto" w:fill="auto"/>
+          <w:tblLayout w:type="fixed"/>
+          <w:tblCellMar>
+            <w:top w:w="0" w:type="dxa"/>
+            <w:left w:w="108" w:type="dxa"/>
+            <w:bottom w:w="0" w:type="dxa"/>
+            <w:right w:w="108" w:type="dxa"/>
+          </w:tblCellMar>
+        </w:tblPrEx>
+        <w:trPr>
+          <w:trHeight w:val="302" w:hRule="atLeast"/>
+        </w:trPr>
+        <w:tc>
+          <w:tcPr>
+            <w:tcW w:w="2319" w:type="dxa"/>
+            <w:tcBorders>
+              <w:tl2br w:val="nil"/>
+              <w:tr2bl w:val="nil"/>
+            </w:tcBorders>
+            <w:shd w:val="clear" w:color="auto" w:fill="auto"/>
+            <w:vAlign w:val="top"/>
+          </w:tcPr>
+          <w:p>
+            <w:pPr>
+              <w:widowControl w:val="0"/>
+              <w:jc w:val="left"/>
+              <w:rPr>
+                <w:rFonts w:hint="default" w:asciiTheme="majorEastAsia" w:hAnsiTheme="majorEastAsia" w:eastAsiaTheme="majorEastAsia" w:cstheme="majorEastAsia"/>
+                <w:b w:val="0"/>
+                <w:bCs w:val="0"/>
+                <w:color w:val="auto"/>
+                <w:sz w:val="20"/>
+                <w:szCs w:val="20"/>
+                <w:vertAlign w:val="baseline"/>
+              </w:rPr>
+            </w:pPr>
+            <w:r>
+              <w:rPr>
+                <w:rFonts w:hint="default" w:asciiTheme="majorEastAsia" w:hAnsiTheme="majorEastAsia" w:eastAsiaTheme="majorEastAsia" w:cstheme="majorEastAsia"/>
+                <w:b w:val="0"/>
+                <w:bCs w:val="0"/>
+                <w:color w:val="auto"/>
+                <w:sz w:val="20"/>
+                <w:szCs w:val="20"/>
+                <w:vertAlign w:val="baseline"/>
+              </w:rPr>
+              <w:t>sor_i</w:t>
+            </w:r>
+          </w:p>
+        </w:tc>
+        <w:tc>
+          <w:tcPr>
+            <w:tcW w:w="840" w:type="dxa"/>
+            <w:tcBorders>
+              <w:tl2br w:val="nil"/>
+              <w:tr2bl w:val="nil"/>
+            </w:tcBorders>
+            <w:shd w:val="clear" w:color="auto" w:fill="auto"/>
+            <w:vAlign w:val="top"/>
+          </w:tcPr>
+          <w:p>
+            <w:pPr>
+              <w:widowControl w:val="0"/>
+              <w:jc w:val="left"/>
+              <w:rPr>
+                <w:rFonts w:hint="default" w:asciiTheme="majorEastAsia" w:hAnsiTheme="majorEastAsia" w:eastAsiaTheme="majorEastAsia" w:cstheme="majorEastAsia"/>
+                <w:b w:val="0"/>
+                <w:bCs w:val="0"/>
+                <w:color w:val="auto"/>
+                <w:sz w:val="20"/>
+                <w:szCs w:val="20"/>
+                <w:vertAlign w:val="baseline"/>
+              </w:rPr>
+            </w:pPr>
+            <w:r>
+              <w:rPr>
+                <w:rFonts w:hint="default" w:asciiTheme="majorEastAsia" w:hAnsiTheme="majorEastAsia" w:eastAsiaTheme="majorEastAsia" w:cstheme="majorEastAsia"/>
+                <w:b w:val="0"/>
+                <w:bCs w:val="0"/>
+                <w:color w:val="auto"/>
+                <w:sz w:val="20"/>
+                <w:szCs w:val="20"/>
+                <w:vertAlign w:val="baseline"/>
+              </w:rPr>
+              <w:t>Input</w:t>
+            </w:r>
+          </w:p>
+        </w:tc>
+        <w:tc>
+          <w:tcPr>
+            <w:tcW w:w="1368" w:type="dxa"/>
+            <w:tcBorders>
+              <w:tl2br w:val="nil"/>
+              <w:tr2bl w:val="nil"/>
+            </w:tcBorders>
+            <w:shd w:val="clear" w:color="auto" w:fill="auto"/>
+            <w:vAlign w:val="top"/>
+          </w:tcPr>
+          <w:p>
+            <w:pPr>
+              <w:widowControl w:val="0"/>
+              <w:jc w:val="left"/>
+              <w:rPr>
+                <w:rFonts w:hint="eastAsia" w:asciiTheme="majorEastAsia" w:hAnsiTheme="majorEastAsia" w:eastAsiaTheme="majorEastAsia" w:cstheme="majorEastAsia"/>
+                <w:b w:val="0"/>
+                <w:bCs w:val="0"/>
+                <w:color w:val="auto"/>
+                <w:sz w:val="20"/>
+                <w:szCs w:val="20"/>
+                <w:vertAlign w:val="baseline"/>
+              </w:rPr>
+            </w:pPr>
+            <w:r>
+              <w:rPr>
+                <w:rFonts w:hint="default" w:asciiTheme="majorEastAsia" w:hAnsiTheme="majorEastAsia" w:eastAsiaTheme="majorEastAsia" w:cstheme="majorEastAsia"/>
+                <w:b w:val="0"/>
+                <w:bCs w:val="0"/>
+                <w:color w:val="auto"/>
+                <w:sz w:val="20"/>
+                <w:szCs w:val="20"/>
+                <w:vertAlign w:val="baseline"/>
+              </w:rPr>
+              <w:t>N</w:t>
+            </w:r>
+            <w:r>
+              <w:rPr>
+                <w:rFonts w:hint="default" w:asciiTheme="majorEastAsia" w:hAnsiTheme="majorEastAsia" w:eastAsiaTheme="majorEastAsia" w:cstheme="majorEastAsia"/>
+                <w:b w:val="0"/>
+                <w:bCs w:val="0"/>
+                <w:color w:val="auto"/>
+                <w:sz w:val="20"/>
+                <w:szCs w:val="20"/>
+                <w:vertAlign w:val="baseline"/>
+              </w:rPr>
+              <w:t>R</w:t>
+            </w:r>
+          </w:p>
+        </w:tc>
+        <w:tc>
+          <w:tcPr>
+            <w:tcW w:w="3995" w:type="dxa"/>
+            <w:tcBorders>
+              <w:tl2br w:val="nil"/>
+              <w:tr2bl w:val="nil"/>
+            </w:tcBorders>
+            <w:shd w:val="clear" w:color="auto" w:fill="auto"/>
+            <w:vAlign w:val="top"/>
+          </w:tcPr>
+          <w:p>
+            <w:pPr>
+              <w:widowControl w:val="0"/>
+              <w:jc w:val="left"/>
+              <w:rPr>
+                <w:rFonts w:hint="eastAsia" w:asciiTheme="majorEastAsia" w:hAnsiTheme="majorEastAsia" w:eastAsiaTheme="majorEastAsia" w:cstheme="majorEastAsia"/>
+                <w:b w:val="0"/>
+                <w:bCs w:val="0"/>
+                <w:color w:val="auto"/>
+                <w:sz w:val="20"/>
+                <w:szCs w:val="20"/>
+                <w:vertAlign w:val="baseline"/>
+              </w:rPr>
+            </w:pPr>
+            <w:r>
+              <w:rPr>
+                <w:rFonts w:hint="default" w:asciiTheme="majorEastAsia" w:hAnsiTheme="majorEastAsia" w:eastAsiaTheme="majorEastAsia" w:cstheme="majorEastAsia"/>
+                <w:b w:val="0"/>
+                <w:bCs w:val="0"/>
+                <w:color w:val="auto"/>
+                <w:sz w:val="20"/>
+                <w:szCs w:val="20"/>
+                <w:vertAlign w:val="baseline"/>
+              </w:rPr>
+              <w:t>Start of request</w:t>
+            </w:r>
+          </w:p>
+        </w:tc>
+      </w:tr>
+      <w:tr>
+        <w:tblPrEx>
+          <w:tblBorders>
+            <w:top w:val="single" w:color="auto" w:sz="4" w:space="0"/>
+            <w:left w:val="single" w:color="auto" w:sz="4" w:space="0"/>
+            <w:bottom w:val="single" w:color="auto" w:sz="4" w:space="0"/>
+            <w:right w:val="single" w:color="auto" w:sz="4" w:space="0"/>
+            <w:insideH w:val="single" w:color="auto" w:sz="4" w:space="0"/>
+            <w:insideV w:val="single" w:color="auto" w:sz="4" w:space="0"/>
+          </w:tblBorders>
+          <w:shd w:val="clear" w:color="auto" w:fill="auto"/>
+          <w:tblLayout w:type="fixed"/>
+          <w:tblCellMar>
+            <w:top w:w="0" w:type="dxa"/>
+            <w:left w:w="108" w:type="dxa"/>
+            <w:bottom w:w="0" w:type="dxa"/>
+            <w:right w:w="108" w:type="dxa"/>
+          </w:tblCellMar>
+        </w:tblPrEx>
+        <w:trPr>
+          <w:trHeight w:val="302" w:hRule="atLeast"/>
+        </w:trPr>
+        <w:tc>
+          <w:tcPr>
+            <w:tcW w:w="2319" w:type="dxa"/>
+            <w:tcBorders>
+              <w:tl2br w:val="nil"/>
+              <w:tr2bl w:val="nil"/>
+            </w:tcBorders>
+            <w:shd w:val="clear" w:color="auto" w:fill="auto"/>
+            <w:vAlign w:val="top"/>
+          </w:tcPr>
+          <w:p>
+            <w:pPr>
+              <w:widowControl w:val="0"/>
+              <w:jc w:val="left"/>
+              <w:rPr>
+                <w:rFonts w:hint="default" w:asciiTheme="majorEastAsia" w:hAnsiTheme="majorEastAsia" w:eastAsiaTheme="majorEastAsia" w:cstheme="majorEastAsia"/>
+                <w:b w:val="0"/>
+                <w:bCs w:val="0"/>
+                <w:color w:val="auto"/>
+                <w:sz w:val="20"/>
+                <w:szCs w:val="20"/>
+                <w:vertAlign w:val="baseline"/>
+              </w:rPr>
+            </w:pPr>
+            <w:r>
+              <w:rPr>
+                <w:rFonts w:hint="default" w:asciiTheme="majorEastAsia" w:hAnsiTheme="majorEastAsia" w:eastAsiaTheme="majorEastAsia" w:cstheme="majorEastAsia"/>
+                <w:b w:val="0"/>
+                <w:bCs w:val="0"/>
+                <w:color w:val="auto"/>
+                <w:sz w:val="20"/>
+                <w:szCs w:val="20"/>
+                <w:vertAlign w:val="baseline"/>
+              </w:rPr>
+              <w:t>eor_i</w:t>
+            </w:r>
+          </w:p>
+        </w:tc>
+        <w:tc>
+          <w:tcPr>
+            <w:tcW w:w="840" w:type="dxa"/>
+            <w:tcBorders>
+              <w:tl2br w:val="nil"/>
+              <w:tr2bl w:val="nil"/>
+            </w:tcBorders>
+            <w:shd w:val="clear" w:color="auto" w:fill="auto"/>
+            <w:vAlign w:val="top"/>
+          </w:tcPr>
+          <w:p>
+            <w:pPr>
+              <w:widowControl w:val="0"/>
+              <w:jc w:val="left"/>
+              <w:rPr>
+                <w:rFonts w:hint="default" w:asciiTheme="majorEastAsia" w:hAnsiTheme="majorEastAsia" w:eastAsiaTheme="majorEastAsia" w:cstheme="majorEastAsia"/>
+                <w:b w:val="0"/>
+                <w:bCs w:val="0"/>
+                <w:color w:val="auto"/>
+                <w:sz w:val="20"/>
+                <w:szCs w:val="20"/>
+                <w:vertAlign w:val="baseline"/>
+              </w:rPr>
+            </w:pPr>
+            <w:r>
+              <w:rPr>
+                <w:rFonts w:hint="default" w:asciiTheme="majorEastAsia" w:hAnsiTheme="majorEastAsia" w:eastAsiaTheme="majorEastAsia" w:cstheme="majorEastAsia"/>
+                <w:b w:val="0"/>
+                <w:bCs w:val="0"/>
+                <w:color w:val="auto"/>
+                <w:sz w:val="20"/>
+                <w:szCs w:val="20"/>
+                <w:vertAlign w:val="baseline"/>
+              </w:rPr>
+              <w:t>Input</w:t>
+            </w:r>
+          </w:p>
+        </w:tc>
+        <w:tc>
+          <w:tcPr>
+            <w:tcW w:w="1368" w:type="dxa"/>
+            <w:tcBorders>
+              <w:tl2br w:val="nil"/>
+              <w:tr2bl w:val="nil"/>
+            </w:tcBorders>
+            <w:shd w:val="clear" w:color="auto" w:fill="auto"/>
+            <w:vAlign w:val="top"/>
+          </w:tcPr>
+          <w:p>
+            <w:pPr>
+              <w:widowControl w:val="0"/>
+              <w:jc w:val="left"/>
+              <w:rPr>
+                <w:rFonts w:hint="eastAsia" w:asciiTheme="majorEastAsia" w:hAnsiTheme="majorEastAsia" w:eastAsiaTheme="majorEastAsia" w:cstheme="majorEastAsia"/>
+                <w:b w:val="0"/>
+                <w:bCs w:val="0"/>
+                <w:color w:val="auto"/>
+                <w:sz w:val="20"/>
+                <w:szCs w:val="20"/>
+                <w:vertAlign w:val="baseline"/>
+              </w:rPr>
+            </w:pPr>
+            <w:r>
+              <w:rPr>
+                <w:rFonts w:hint="default" w:asciiTheme="majorEastAsia" w:hAnsiTheme="majorEastAsia" w:eastAsiaTheme="majorEastAsia" w:cstheme="majorEastAsia"/>
+                <w:b w:val="0"/>
+                <w:bCs w:val="0"/>
+                <w:color w:val="auto"/>
+                <w:sz w:val="20"/>
+                <w:szCs w:val="20"/>
+                <w:vertAlign w:val="baseline"/>
+              </w:rPr>
+              <w:t>N</w:t>
+            </w:r>
+            <w:r>
+              <w:rPr>
+                <w:rFonts w:hint="default" w:asciiTheme="majorEastAsia" w:hAnsiTheme="majorEastAsia" w:eastAsiaTheme="majorEastAsia" w:cstheme="majorEastAsia"/>
+                <w:b w:val="0"/>
+                <w:bCs w:val="0"/>
+                <w:color w:val="auto"/>
+                <w:sz w:val="20"/>
+                <w:szCs w:val="20"/>
+                <w:vertAlign w:val="baseline"/>
+              </w:rPr>
+              <w:t>R</w:t>
+            </w:r>
+          </w:p>
+        </w:tc>
+        <w:tc>
+          <w:tcPr>
+            <w:tcW w:w="3995" w:type="dxa"/>
+            <w:tcBorders>
+              <w:tl2br w:val="nil"/>
+              <w:tr2bl w:val="nil"/>
+            </w:tcBorders>
+            <w:shd w:val="clear" w:color="auto" w:fill="auto"/>
+            <w:vAlign w:val="top"/>
+          </w:tcPr>
+          <w:p>
+            <w:pPr>
+              <w:widowControl w:val="0"/>
+              <w:jc w:val="left"/>
+              <w:rPr>
+                <w:rFonts w:hint="eastAsia" w:asciiTheme="majorEastAsia" w:hAnsiTheme="majorEastAsia" w:eastAsiaTheme="majorEastAsia" w:cstheme="majorEastAsia"/>
+                <w:b w:val="0"/>
+                <w:bCs w:val="0"/>
+                <w:color w:val="auto"/>
+                <w:sz w:val="20"/>
+                <w:szCs w:val="20"/>
+                <w:vertAlign w:val="baseline"/>
+              </w:rPr>
+            </w:pPr>
+            <w:r>
+              <w:rPr>
+                <w:rFonts w:hint="default" w:asciiTheme="majorEastAsia" w:hAnsiTheme="majorEastAsia" w:eastAsiaTheme="majorEastAsia" w:cstheme="majorEastAsia"/>
+                <w:b w:val="0"/>
+                <w:bCs w:val="0"/>
+                <w:color w:val="auto"/>
+                <w:sz w:val="20"/>
+                <w:szCs w:val="20"/>
+                <w:vertAlign w:val="baseline"/>
+              </w:rPr>
+              <w:t>End of request</w:t>
+            </w:r>
+          </w:p>
+        </w:tc>
+      </w:tr>
+      <w:tr>
+        <w:tblPrEx>
+          <w:tblBorders>
+            <w:top w:val="single" w:color="auto" w:sz="4" w:space="0"/>
+            <w:left w:val="single" w:color="auto" w:sz="4" w:space="0"/>
+            <w:bottom w:val="single" w:color="auto" w:sz="4" w:space="0"/>
+            <w:right w:val="single" w:color="auto" w:sz="4" w:space="0"/>
+            <w:insideH w:val="single" w:color="auto" w:sz="4" w:space="0"/>
+            <w:insideV w:val="single" w:color="auto" w:sz="4" w:space="0"/>
+          </w:tblBorders>
+          <w:shd w:val="clear" w:color="auto" w:fill="auto"/>
+          <w:tblLayout w:type="fixed"/>
+          <w:tblCellMar>
+            <w:top w:w="0" w:type="dxa"/>
+            <w:left w:w="108" w:type="dxa"/>
+            <w:bottom w:w="0" w:type="dxa"/>
+            <w:right w:w="108" w:type="dxa"/>
+          </w:tblCellMar>
+        </w:tblPrEx>
+        <w:trPr>
+          <w:trHeight w:val="302" w:hRule="atLeast"/>
+        </w:trPr>
+        <w:tc>
+          <w:tcPr>
+            <w:tcW w:w="2319" w:type="dxa"/>
+            <w:tcBorders>
+              <w:tl2br w:val="nil"/>
+              <w:tr2bl w:val="nil"/>
+            </w:tcBorders>
+            <w:shd w:val="clear" w:color="auto" w:fill="auto"/>
+            <w:vAlign w:val="top"/>
+          </w:tcPr>
+          <w:p>
+            <w:pPr>
+              <w:widowControl w:val="0"/>
+              <w:jc w:val="left"/>
+              <w:rPr>
+                <w:rFonts w:hint="default" w:asciiTheme="majorEastAsia" w:hAnsiTheme="majorEastAsia" w:eastAsiaTheme="majorEastAsia" w:cstheme="majorEastAsia"/>
+                <w:b w:val="0"/>
+                <w:bCs w:val="0"/>
+                <w:color w:val="auto"/>
+                <w:sz w:val="20"/>
+                <w:szCs w:val="20"/>
+                <w:vertAlign w:val="baseline"/>
+              </w:rPr>
+            </w:pPr>
+            <w:r>
+              <w:rPr>
+                <w:rFonts w:hint="default" w:asciiTheme="majorEastAsia" w:hAnsiTheme="majorEastAsia" w:eastAsiaTheme="majorEastAsia" w:cstheme="majorEastAsia"/>
+                <w:b w:val="0"/>
+                <w:bCs w:val="0"/>
+                <w:color w:val="auto"/>
+                <w:sz w:val="20"/>
+                <w:szCs w:val="20"/>
+                <w:vertAlign w:val="baseline"/>
+              </w:rPr>
+              <w:t>grant_o</w:t>
+            </w:r>
+          </w:p>
+        </w:tc>
+        <w:tc>
+          <w:tcPr>
+            <w:tcW w:w="840" w:type="dxa"/>
+            <w:tcBorders>
+              <w:tl2br w:val="nil"/>
+              <w:tr2bl w:val="nil"/>
+            </w:tcBorders>
+            <w:shd w:val="clear" w:color="auto" w:fill="auto"/>
+            <w:vAlign w:val="top"/>
+          </w:tcPr>
+          <w:p>
+            <w:pPr>
+              <w:widowControl w:val="0"/>
+              <w:jc w:val="left"/>
+              <w:rPr>
+                <w:rFonts w:hint="default" w:asciiTheme="majorEastAsia" w:hAnsiTheme="majorEastAsia" w:eastAsiaTheme="majorEastAsia" w:cstheme="majorEastAsia"/>
+                <w:b w:val="0"/>
+                <w:bCs w:val="0"/>
+                <w:color w:val="auto"/>
+                <w:sz w:val="20"/>
+                <w:szCs w:val="20"/>
+                <w:vertAlign w:val="baseline"/>
+              </w:rPr>
+            </w:pPr>
+            <w:r>
+              <w:rPr>
+                <w:rFonts w:hint="default" w:asciiTheme="majorEastAsia" w:hAnsiTheme="majorEastAsia" w:eastAsiaTheme="majorEastAsia" w:cstheme="majorEastAsia"/>
+                <w:b w:val="0"/>
+                <w:bCs w:val="0"/>
+                <w:color w:val="auto"/>
+                <w:sz w:val="20"/>
+                <w:szCs w:val="20"/>
+                <w:vertAlign w:val="baseline"/>
+              </w:rPr>
+              <w:t>Ouput</w:t>
+            </w:r>
+          </w:p>
+        </w:tc>
+        <w:tc>
+          <w:tcPr>
+            <w:tcW w:w="1368" w:type="dxa"/>
+            <w:tcBorders>
+              <w:tl2br w:val="nil"/>
+              <w:tr2bl w:val="nil"/>
+            </w:tcBorders>
+            <w:shd w:val="clear" w:color="auto" w:fill="auto"/>
+            <w:textDirection w:val="lrTbV"/>
+            <w:vAlign w:val="center"/>
+          </w:tcPr>
+          <w:p>
+            <w:pPr>
+              <w:widowControl w:val="0"/>
+              <w:jc w:val="both"/>
+              <w:rPr>
+                <w:rFonts w:hint="eastAsia" w:asciiTheme="majorEastAsia" w:hAnsiTheme="majorEastAsia" w:eastAsiaTheme="majorEastAsia" w:cstheme="majorEastAsia"/>
+                <w:b w:val="0"/>
+                <w:bCs w:val="0"/>
+                <w:color w:val="auto"/>
+                <w:sz w:val="20"/>
+                <w:szCs w:val="20"/>
+                <w:vertAlign w:val="baseline"/>
+              </w:rPr>
+            </w:pPr>
+            <w:r>
+              <w:rPr>
+                <w:rFonts w:hint="default" w:asciiTheme="majorEastAsia" w:hAnsiTheme="majorEastAsia" w:eastAsiaTheme="majorEastAsia" w:cstheme="majorEastAsia"/>
+                <w:b w:val="0"/>
+                <w:bCs w:val="0"/>
+                <w:color w:val="auto"/>
+                <w:sz w:val="20"/>
+                <w:szCs w:val="20"/>
+                <w:vertAlign w:val="baseline"/>
+              </w:rPr>
+              <w:t>N</w:t>
+            </w:r>
+            <w:r>
+              <w:rPr>
+                <w:rFonts w:hint="default" w:asciiTheme="majorEastAsia" w:hAnsiTheme="majorEastAsia" w:eastAsiaTheme="majorEastAsia" w:cstheme="majorEastAsia"/>
+                <w:b w:val="0"/>
+                <w:bCs w:val="0"/>
+                <w:color w:val="auto"/>
+                <w:sz w:val="20"/>
+                <w:szCs w:val="20"/>
+                <w:vertAlign w:val="baseline"/>
+              </w:rPr>
+              <w:t>R</w:t>
+            </w:r>
+          </w:p>
+        </w:tc>
+        <w:tc>
+          <w:tcPr>
+            <w:tcW w:w="3995" w:type="dxa"/>
+            <w:tcBorders>
+              <w:tl2br w:val="nil"/>
+              <w:tr2bl w:val="nil"/>
+            </w:tcBorders>
+            <w:shd w:val="clear" w:color="auto" w:fill="auto"/>
+            <w:vAlign w:val="top"/>
+          </w:tcPr>
+          <w:p>
+            <w:pPr>
+              <w:widowControl w:val="0"/>
+              <w:jc w:val="left"/>
+              <w:rPr>
+                <w:rFonts w:hint="eastAsia" w:asciiTheme="majorEastAsia" w:hAnsiTheme="majorEastAsia" w:eastAsiaTheme="majorEastAsia" w:cstheme="majorEastAsia"/>
+                <w:b w:val="0"/>
+                <w:bCs w:val="0"/>
+                <w:color w:val="auto"/>
+                <w:sz w:val="20"/>
+                <w:szCs w:val="20"/>
+                <w:vertAlign w:val="baseline"/>
+              </w:rPr>
+            </w:pPr>
+            <w:r>
+              <w:rPr>
+                <w:rFonts w:hint="default" w:asciiTheme="majorEastAsia" w:hAnsiTheme="majorEastAsia" w:eastAsiaTheme="majorEastAsia" w:cstheme="majorEastAsia"/>
+                <w:b w:val="0"/>
+                <w:bCs w:val="0"/>
+                <w:color w:val="auto"/>
+                <w:sz w:val="20"/>
+                <w:szCs w:val="20"/>
+                <w:vertAlign w:val="baseline"/>
+              </w:rPr>
+              <w:t>Granted request</w:t>
+            </w:r>
+          </w:p>
+        </w:tc>
+      </w:tr>
+    </w:tbl>
+    <w:p>
+      <w:pPr>
+        <w:numPr>
+          <w:numId w:val="0"/>
+        </w:numPr>
+        <w:jc w:val="left"/>
+        <w:outlineLvl w:val="0"/>
+        <w:rPr>
+          <w:rFonts w:hint="eastAsia" w:asciiTheme="majorEastAsia" w:hAnsiTheme="majorEastAsia" w:eastAsiaTheme="majorEastAsia" w:cstheme="majorEastAsia"/>
+          <w:b/>
+          <w:bCs/>
+          <w:i w:val="0"/>
+          <w:iCs w:val="0"/>
+          <w:color w:val="002060"/>
+          <w:sz w:val="20"/>
+          <w:szCs w:val="20"/>
+        </w:rPr>
+      </w:pPr>
+    </w:p>
+    <w:p>
+      <w:pPr>
+        <w:numPr>
+          <w:ilvl w:val="2"/>
+          <w:numId w:val="3"/>
+        </w:numPr>
+        <w:ind w:left="0" w:leftChars="0" w:firstLine="0" w:firstLineChars="0"/>
+        <w:jc w:val="left"/>
+        <w:outlineLvl w:val="0"/>
+        <w:rPr>
+          <w:rFonts w:hint="eastAsia" w:asciiTheme="majorEastAsia" w:hAnsiTheme="majorEastAsia" w:eastAsiaTheme="majorEastAsia" w:cstheme="majorEastAsia"/>
+          <w:b/>
+          <w:bCs/>
+          <w:i w:val="0"/>
+          <w:iCs w:val="0"/>
+          <w:color w:val="002060"/>
+          <w:sz w:val="20"/>
+          <w:szCs w:val="20"/>
+        </w:rPr>
+      </w:pPr>
+      <w:r>
+        <w:rPr>
+          <w:rFonts w:hint="default" w:asciiTheme="majorEastAsia" w:hAnsiTheme="majorEastAsia" w:eastAsiaTheme="majorEastAsia" w:cstheme="majorEastAsia"/>
+          <w:b/>
+          <w:bCs/>
+          <w:i w:val="0"/>
+          <w:iCs w:val="0"/>
+          <w:color w:val="002060"/>
+          <w:sz w:val="20"/>
+          <w:szCs w:val="20"/>
+        </w:rPr>
+        <w:t>Operation</w:t>
+      </w:r>
+    </w:p>
+    <w:p>
+      <w:pPr>
+        <w:numPr>
+          <w:numId w:val="0"/>
+        </w:numPr>
+        <w:ind w:left="0" w:leftChars="0" w:firstLine="400" w:firstLineChars="200"/>
+        <w:jc w:val="left"/>
+        <w:outlineLvl w:val="0"/>
+        <w:rPr>
+          <w:rFonts w:hint="eastAsia" w:asciiTheme="majorEastAsia" w:hAnsiTheme="majorEastAsia" w:eastAsiaTheme="majorEastAsia" w:cstheme="majorEastAsia"/>
+          <w:b w:val="0"/>
+          <w:bCs w:val="0"/>
+          <w:i w:val="0"/>
+          <w:iCs w:val="0"/>
+          <w:color w:val="auto"/>
+          <w:sz w:val="20"/>
+          <w:szCs w:val="20"/>
+        </w:rPr>
+      </w:pPr>
+      <w:r>
+        <w:rPr>
+          <w:rFonts w:hint="default" w:asciiTheme="majorEastAsia" w:hAnsiTheme="majorEastAsia" w:eastAsiaTheme="majorEastAsia" w:cstheme="majorEastAsia"/>
+          <w:b w:val="0"/>
+          <w:bCs w:val="0"/>
+          <w:i w:val="0"/>
+          <w:iCs w:val="0"/>
+          <w:color w:val="auto"/>
+          <w:sz w:val="20"/>
+          <w:szCs w:val="20"/>
+        </w:rPr>
+        <w:t>This</w:t>
+      </w:r>
+    </w:p>
+    <w:p>
+      <w:pPr>
+        <w:numPr>
+          <w:ilvl w:val="2"/>
+          <w:numId w:val="3"/>
+        </w:numPr>
+        <w:ind w:left="0" w:leftChars="0" w:firstLine="0" w:firstLineChars="0"/>
+        <w:jc w:val="left"/>
+        <w:outlineLvl w:val="0"/>
+        <w:rPr>
+          <w:rFonts w:hint="eastAsia" w:asciiTheme="majorEastAsia" w:hAnsiTheme="majorEastAsia" w:eastAsiaTheme="majorEastAsia" w:cstheme="majorEastAsia"/>
+          <w:b/>
+          <w:bCs/>
+          <w:i w:val="0"/>
+          <w:iCs w:val="0"/>
+          <w:color w:val="002060"/>
+          <w:sz w:val="20"/>
+          <w:szCs w:val="20"/>
+        </w:rPr>
+      </w:pPr>
+      <w:r>
+        <w:rPr>
+          <w:rFonts w:hint="default" w:asciiTheme="majorEastAsia" w:hAnsiTheme="majorEastAsia" w:eastAsiaTheme="majorEastAsia" w:cstheme="majorEastAsia"/>
+          <w:b/>
+          <w:bCs/>
+          <w:i w:val="0"/>
+          <w:iCs w:val="0"/>
+          <w:color w:val="002060"/>
+          <w:sz w:val="20"/>
+          <w:szCs w:val="20"/>
+        </w:rPr>
+        <w:t>Implentation</w:t>
+      </w:r>
     </w:p>
     <w:p>
       <w:pPr>
@@ -5619,6 +7568,97 @@
         </w:rPr>
         <w:t>The block diagram in figure below describe how three top module (AHB Interconnect, AHB Master, AHB Slave) are connected together to form a comprehensive bus system which support high performance communicating between several AHB Master devices (CPU, DMA,...) and Slave devices (BRAM Controller, APB bridge,...).</w:t>
       </w:r>
+    </w:p>
+    <w:p>
+      <w:pPr>
+        <w:numPr>
+          <w:ilvl w:val="0"/>
+          <w:numId w:val="0"/>
+        </w:numPr>
+        <w:ind w:left="0" w:leftChars="0" w:firstLine="400" w:firstLineChars="200"/>
+        <w:jc w:val="center"/>
+        <w:outlineLvl w:val="0"/>
+        <w:rPr>
+          <w:rFonts w:hint="default" w:asciiTheme="majorEastAsia" w:hAnsiTheme="majorEastAsia" w:eastAsiaTheme="majorEastAsia" w:cstheme="majorEastAsia"/>
+          <w:b w:val="0"/>
+          <w:bCs w:val="0"/>
+          <w:i w:val="0"/>
+          <w:iCs w:val="0"/>
+          <w:color w:val="auto"/>
+          <w:sz w:val="20"/>
+          <w:szCs w:val="20"/>
+        </w:rPr>
+      </w:pPr>
+      <w:r>
+        <w:rPr>
+          <w:rFonts w:hint="default" w:asciiTheme="majorEastAsia" w:hAnsiTheme="majorEastAsia" w:eastAsiaTheme="majorEastAsia" w:cstheme="majorEastAsia"/>
+          <w:b w:val="0"/>
+          <w:bCs w:val="0"/>
+          <w:i w:val="0"/>
+          <w:iCs w:val="0"/>
+          <w:color w:val="auto"/>
+          <w:sz w:val="20"/>
+          <w:szCs w:val="20"/>
+        </w:rPr>
+        <w:drawing>
+          <wp:inline distT="0" distB="0" distL="114300" distR="114300">
+            <wp:extent cx="4399915" cy="2305050"/>
+            <wp:effectExtent l="0" t="0" r="635" b="0"/>
+            <wp:docPr id="2" name="Picture 2" descr="spmcu_ahb"/>
+            <wp:cNvGraphicFramePr>
+              <a:graphicFrameLocks xmlns:a="http://schemas.openxmlformats.org/drawingml/2006/main" noChangeAspect="1"/>
+            </wp:cNvGraphicFramePr>
+            <a:graphic xmlns:a="http://schemas.openxmlformats.org/drawingml/2006/main">
+              <a:graphicData uri="http://schemas.openxmlformats.org/drawingml/2006/picture">
+                <pic:pic xmlns:pic="http://schemas.openxmlformats.org/drawingml/2006/picture">
+                  <pic:nvPicPr>
+                    <pic:cNvPr id="2" name="Picture 2" descr="spmcu_ahb"/>
+                    <pic:cNvPicPr>
+                      <a:picLocks noChangeAspect="1"/>
+                    </pic:cNvPicPr>
+                  </pic:nvPicPr>
+                  <pic:blipFill>
+                    <a:blip r:embed="rId6"/>
+                    <a:stretch>
+                      <a:fillRect/>
+                    </a:stretch>
+                  </pic:blipFill>
+                  <pic:spPr>
+                    <a:xfrm>
+                      <a:off x="0" y="0"/>
+                      <a:ext cx="4399915" cy="2305050"/>
+                    </a:xfrm>
+                    <a:prstGeom prst="rect">
+                      <a:avLst/>
+                    </a:prstGeom>
+                  </pic:spPr>
+                </pic:pic>
+              </a:graphicData>
+            </a:graphic>
+          </wp:inline>
+        </w:drawing>
+      </w:r>
+    </w:p>
+    <w:p>
+      <w:pPr>
+        <w:numPr>
+          <w:ilvl w:val="0"/>
+          <w:numId w:val="0"/>
+        </w:numPr>
+        <w:ind w:left="0" w:leftChars="0" w:firstLine="400" w:firstLineChars="200"/>
+        <w:jc w:val="center"/>
+        <w:outlineLvl w:val="0"/>
+        <w:rPr>
+          <w:rFonts w:hint="default" w:asciiTheme="majorEastAsia" w:hAnsiTheme="majorEastAsia" w:eastAsiaTheme="majorEastAsia" w:cstheme="majorEastAsia"/>
+          <w:b w:val="0"/>
+          <w:bCs w:val="0"/>
+          <w:i w:val="0"/>
+          <w:iCs w:val="0"/>
+          <w:color w:val="auto"/>
+          <w:sz w:val="20"/>
+          <w:szCs w:val="20"/>
+        </w:rPr>
+      </w:pPr>
     </w:p>
     <w:p>
       <w:pPr>
@@ -5775,20 +7815,7 @@
                 <w:sz w:val="20"/>
                 <w:szCs w:val="20"/>
               </w:rPr>
-              <w:t>D</w:t>
-            </w:r>
-            <w:r>
-              <w:rPr>
-                <w:rFonts w:hint="default" w:asciiTheme="majorEastAsia" w:hAnsiTheme="majorEastAsia" w:eastAsiaTheme="majorEastAsia" w:cstheme="majorEastAsia"/>
-                <w:b/>
-                <w:bCs/>
-                <w:i w:val="0"/>
-                <w:iCs w:val="0"/>
-                <w:color w:val="auto"/>
-                <w:sz w:val="20"/>
-                <w:szCs w:val="20"/>
-              </w:rPr>
-              <w:t>irectory:</w:t>
+              <w:t>Directory:</w:t>
             </w:r>
           </w:p>
         </w:tc>
@@ -6094,394 +8121,7 @@
           <w:rFonts w:hint="eastAsia" w:asciiTheme="minorEastAsia" w:hAnsiTheme="minorEastAsia" w:eastAsiaTheme="minorEastAsia" w:cstheme="minorEastAsia"/>
           <w:color w:val="002060"/>
         </w:rPr>
-        <w:t>4</w:t>
-      </w:r>
-      <w:r>
-        <w:rPr>
-          <w:rFonts w:hint="eastAsia" w:asciiTheme="minorEastAsia" w:hAnsiTheme="minorEastAsia" w:eastAsiaTheme="minorEastAsia" w:cstheme="minorEastAsia"/>
-          <w:color w:val="002060"/>
-        </w:rPr>
-        <w:fldChar w:fldCharType="end"/>
-      </w:r>
-      <w:r>
-        <w:rPr>
-          <w:rFonts w:hint="eastAsia" w:asciiTheme="minorEastAsia" w:hAnsiTheme="minorEastAsia" w:eastAsiaTheme="minorEastAsia" w:cstheme="minorEastAsia"/>
-          <w:color w:val="002060"/>
-        </w:rPr>
-        <w:t xml:space="preserve"> - AHB Interconnect define macros</w:t>
-      </w:r>
-    </w:p>
-    <w:tbl>
-      <w:tblPr>
-        <w:tblStyle w:val="5"/>
-        <w:tblW w:w="8499" w:type="dxa"/>
-        <w:tblInd w:w="0" w:type="dxa"/>
-        <w:tblBorders>
-          <w:top w:val="single" w:color="auto" w:sz="4" w:space="0"/>
-          <w:left w:val="single" w:color="auto" w:sz="4" w:space="0"/>
-          <w:bottom w:val="single" w:color="auto" w:sz="4" w:space="0"/>
-          <w:right w:val="single" w:color="auto" w:sz="4" w:space="0"/>
-          <w:insideH w:val="single" w:color="auto" w:sz="4" w:space="0"/>
-          <w:insideV w:val="single" w:color="auto" w:sz="4" w:space="0"/>
-        </w:tblBorders>
-        <w:shd w:val="clear" w:color="auto" w:fill="auto"/>
-        <w:tblLayout w:type="fixed"/>
-        <w:tblCellMar>
-          <w:top w:w="0" w:type="dxa"/>
-          <w:left w:w="108" w:type="dxa"/>
-          <w:bottom w:w="0" w:type="dxa"/>
-          <w:right w:w="108" w:type="dxa"/>
-        </w:tblCellMar>
-      </w:tblPr>
-      <w:tblGrid>
-        <w:gridCol w:w="2130"/>
-        <w:gridCol w:w="5364"/>
-        <w:gridCol w:w="1005"/>
-      </w:tblGrid>
-      <w:tr>
-        <w:tblPrEx>
-          <w:tblBorders>
-            <w:top w:val="single" w:color="auto" w:sz="4" w:space="0"/>
-            <w:left w:val="single" w:color="auto" w:sz="4" w:space="0"/>
-            <w:bottom w:val="single" w:color="auto" w:sz="4" w:space="0"/>
-            <w:right w:val="single" w:color="auto" w:sz="4" w:space="0"/>
-            <w:insideH w:val="single" w:color="auto" w:sz="4" w:space="0"/>
-            <w:insideV w:val="single" w:color="auto" w:sz="4" w:space="0"/>
-          </w:tblBorders>
-          <w:tblLayout w:type="fixed"/>
-          <w:tblCellMar>
-            <w:top w:w="0" w:type="dxa"/>
-            <w:left w:w="108" w:type="dxa"/>
-            <w:bottom w:w="0" w:type="dxa"/>
-            <w:right w:w="108" w:type="dxa"/>
-          </w:tblCellMar>
-        </w:tblPrEx>
-        <w:trPr>
-          <w:trHeight w:val="302" w:hRule="atLeast"/>
-        </w:trPr>
-        <w:tc>
-          <w:tcPr>
-            <w:tcW w:w="2130" w:type="dxa"/>
-            <w:tcBorders>
-              <w:tl2br w:val="nil"/>
-              <w:tr2bl w:val="nil"/>
-            </w:tcBorders>
-            <w:shd w:val="clear" w:color="auto" w:fill="A5A5A5" w:themeFill="accent3"/>
-            <w:vAlign w:val="center"/>
-          </w:tcPr>
-          <w:p>
-            <w:pPr>
-              <w:widowControl w:val="0"/>
-              <w:jc w:val="both"/>
-              <w:rPr>
-                <w:rFonts w:hint="eastAsia" w:asciiTheme="majorEastAsia" w:hAnsiTheme="majorEastAsia" w:eastAsiaTheme="majorEastAsia" w:cstheme="majorEastAsia"/>
-                <w:b/>
-                <w:bCs/>
-                <w:color w:val="002060"/>
-                <w:sz w:val="20"/>
-                <w:szCs w:val="20"/>
-                <w:shd w:val="clear" w:color="auto" w:fill="auto"/>
-                <w:vertAlign w:val="baseline"/>
-              </w:rPr>
-            </w:pPr>
-            <w:r>
-              <w:rPr>
-                <w:rFonts w:hint="eastAsia" w:asciiTheme="majorEastAsia" w:hAnsiTheme="majorEastAsia" w:eastAsiaTheme="majorEastAsia" w:cstheme="majorEastAsia"/>
-                <w:b/>
-                <w:bCs/>
-                <w:color w:val="002060"/>
-                <w:sz w:val="20"/>
-                <w:szCs w:val="20"/>
-                <w:shd w:val="clear" w:color="auto" w:fill="auto"/>
-                <w:vertAlign w:val="baseline"/>
-              </w:rPr>
-              <w:t>D</w:t>
-            </w:r>
-            <w:r>
-              <w:rPr>
-                <w:rFonts w:hint="default" w:asciiTheme="majorEastAsia" w:hAnsiTheme="majorEastAsia" w:eastAsiaTheme="majorEastAsia" w:cstheme="majorEastAsia"/>
-                <w:b/>
-                <w:bCs/>
-                <w:color w:val="002060"/>
-                <w:sz w:val="20"/>
-                <w:szCs w:val="20"/>
-                <w:shd w:val="clear" w:color="auto" w:fill="auto"/>
-                <w:vertAlign w:val="baseline"/>
-              </w:rPr>
-              <w:t>efine</w:t>
-            </w:r>
-          </w:p>
-        </w:tc>
-        <w:tc>
-          <w:tcPr>
-            <w:tcW w:w="5364" w:type="dxa"/>
-            <w:tcBorders>
-              <w:tl2br w:val="nil"/>
-              <w:tr2bl w:val="nil"/>
-            </w:tcBorders>
-            <w:shd w:val="clear" w:color="auto" w:fill="A5A5A5" w:themeFill="accent3"/>
-            <w:vAlign w:val="center"/>
-          </w:tcPr>
-          <w:p>
-            <w:pPr>
-              <w:widowControl w:val="0"/>
-              <w:jc w:val="both"/>
-              <w:rPr>
-                <w:rFonts w:hint="eastAsia" w:asciiTheme="majorEastAsia" w:hAnsiTheme="majorEastAsia" w:eastAsiaTheme="majorEastAsia" w:cstheme="majorEastAsia"/>
-                <w:b/>
-                <w:bCs/>
-                <w:color w:val="002060"/>
-                <w:sz w:val="20"/>
-                <w:szCs w:val="20"/>
-                <w:shd w:val="clear" w:color="auto" w:fill="auto"/>
-                <w:vertAlign w:val="baseline"/>
-              </w:rPr>
-            </w:pPr>
-            <w:r>
-              <w:rPr>
-                <w:rFonts w:hint="default" w:asciiTheme="majorEastAsia" w:hAnsiTheme="majorEastAsia" w:eastAsiaTheme="majorEastAsia" w:cstheme="majorEastAsia"/>
-                <w:b/>
-                <w:bCs/>
-                <w:color w:val="002060"/>
-                <w:sz w:val="20"/>
-                <w:szCs w:val="20"/>
-                <w:shd w:val="clear" w:color="auto" w:fill="auto"/>
-                <w:vertAlign w:val="baseline"/>
-              </w:rPr>
-              <w:t>Detail</w:t>
-            </w:r>
-          </w:p>
-        </w:tc>
-        <w:tc>
-          <w:tcPr>
-            <w:tcW w:w="1005" w:type="dxa"/>
-            <w:tcBorders>
-              <w:tl2br w:val="nil"/>
-              <w:tr2bl w:val="nil"/>
-            </w:tcBorders>
-            <w:shd w:val="clear" w:color="auto" w:fill="A5A5A5" w:themeFill="accent3"/>
-            <w:vAlign w:val="center"/>
-          </w:tcPr>
-          <w:p>
-            <w:pPr>
-              <w:widowControl w:val="0"/>
-              <w:jc w:val="both"/>
-              <w:rPr>
-                <w:rFonts w:hint="eastAsia" w:asciiTheme="majorEastAsia" w:hAnsiTheme="majorEastAsia" w:eastAsiaTheme="majorEastAsia" w:cstheme="majorEastAsia"/>
-                <w:b/>
-                <w:bCs/>
-                <w:color w:val="002060"/>
-                <w:sz w:val="20"/>
-                <w:szCs w:val="20"/>
-                <w:shd w:val="clear" w:color="auto" w:fill="auto"/>
-                <w:vertAlign w:val="baseline"/>
-              </w:rPr>
-            </w:pPr>
-            <w:r>
-              <w:rPr>
-                <w:rFonts w:hint="default" w:asciiTheme="majorEastAsia" w:hAnsiTheme="majorEastAsia" w:eastAsiaTheme="majorEastAsia" w:cstheme="majorEastAsia"/>
-                <w:b/>
-                <w:bCs/>
-                <w:color w:val="002060"/>
-                <w:sz w:val="20"/>
-                <w:szCs w:val="20"/>
-                <w:shd w:val="clear" w:color="auto" w:fill="auto"/>
-                <w:vertAlign w:val="baseline"/>
-              </w:rPr>
-              <w:t>*Status</w:t>
-            </w:r>
-          </w:p>
-        </w:tc>
-      </w:tr>
-      <w:tr>
-        <w:tblPrEx>
-          <w:tblBorders>
-            <w:top w:val="single" w:color="auto" w:sz="4" w:space="0"/>
-            <w:left w:val="single" w:color="auto" w:sz="4" w:space="0"/>
-            <w:bottom w:val="single" w:color="auto" w:sz="4" w:space="0"/>
-            <w:right w:val="single" w:color="auto" w:sz="4" w:space="0"/>
-            <w:insideH w:val="single" w:color="auto" w:sz="4" w:space="0"/>
-            <w:insideV w:val="single" w:color="auto" w:sz="4" w:space="0"/>
-          </w:tblBorders>
-          <w:tblLayout w:type="fixed"/>
-          <w:tblCellMar>
-            <w:top w:w="0" w:type="dxa"/>
-            <w:left w:w="108" w:type="dxa"/>
-            <w:bottom w:w="0" w:type="dxa"/>
-            <w:right w:w="108" w:type="dxa"/>
-          </w:tblCellMar>
-        </w:tblPrEx>
-        <w:trPr>
-          <w:trHeight w:val="302" w:hRule="atLeast"/>
-        </w:trPr>
-        <w:tc>
-          <w:tcPr>
-            <w:tcW w:w="2130" w:type="dxa"/>
-            <w:tcBorders>
-              <w:tl2br w:val="nil"/>
-              <w:tr2bl w:val="nil"/>
-            </w:tcBorders>
-            <w:shd w:val="clear" w:color="auto" w:fill="auto"/>
-            <w:vAlign w:val="top"/>
-          </w:tcPr>
-          <w:p>
-            <w:pPr>
-              <w:widowControl w:val="0"/>
-              <w:jc w:val="both"/>
-              <w:rPr>
-                <w:rFonts w:hint="eastAsia" w:asciiTheme="majorEastAsia" w:hAnsiTheme="majorEastAsia" w:eastAsiaTheme="majorEastAsia" w:cstheme="majorEastAsia"/>
-                <w:b w:val="0"/>
-                <w:bCs w:val="0"/>
-                <w:color w:val="auto"/>
-                <w:sz w:val="20"/>
-                <w:szCs w:val="20"/>
-                <w:vertAlign w:val="baseline"/>
-              </w:rPr>
-            </w:pPr>
-          </w:p>
-        </w:tc>
-        <w:tc>
-          <w:tcPr>
-            <w:tcW w:w="5364" w:type="dxa"/>
-            <w:tcBorders>
-              <w:tl2br w:val="nil"/>
-              <w:tr2bl w:val="nil"/>
-            </w:tcBorders>
-            <w:shd w:val="clear" w:color="auto" w:fill="auto"/>
-            <w:vAlign w:val="top"/>
-          </w:tcPr>
-          <w:p>
-            <w:pPr>
-              <w:widowControl w:val="0"/>
-              <w:jc w:val="both"/>
-              <w:rPr>
-                <w:rFonts w:hint="eastAsia" w:asciiTheme="majorEastAsia" w:hAnsiTheme="majorEastAsia" w:eastAsiaTheme="majorEastAsia" w:cstheme="majorEastAsia"/>
-                <w:b w:val="0"/>
-                <w:bCs w:val="0"/>
-                <w:color w:val="auto"/>
-                <w:sz w:val="20"/>
-                <w:szCs w:val="20"/>
-                <w:vertAlign w:val="baseline"/>
-              </w:rPr>
-            </w:pPr>
-          </w:p>
-        </w:tc>
-        <w:tc>
-          <w:tcPr>
-            <w:tcW w:w="1005" w:type="dxa"/>
-            <w:tcBorders>
-              <w:tl2br w:val="nil"/>
-              <w:tr2bl w:val="nil"/>
-            </w:tcBorders>
-            <w:shd w:val="clear" w:color="auto" w:fill="auto"/>
-            <w:vAlign w:val="top"/>
-          </w:tcPr>
-          <w:p>
-            <w:pPr>
-              <w:widowControl w:val="0"/>
-              <w:jc w:val="both"/>
-              <w:rPr>
-                <w:rFonts w:hint="eastAsia" w:asciiTheme="majorEastAsia" w:hAnsiTheme="majorEastAsia" w:eastAsiaTheme="majorEastAsia" w:cstheme="majorEastAsia"/>
-                <w:b w:val="0"/>
-                <w:bCs w:val="0"/>
-                <w:color w:val="auto"/>
-                <w:sz w:val="20"/>
-                <w:szCs w:val="20"/>
-                <w:vertAlign w:val="baseline"/>
-              </w:rPr>
-            </w:pPr>
-            <w:r>
-              <w:rPr>
-                <w:rFonts w:hint="default" w:asciiTheme="majorEastAsia" w:hAnsiTheme="majorEastAsia" w:eastAsiaTheme="majorEastAsia" w:cstheme="majorEastAsia"/>
-                <w:b w:val="0"/>
-                <w:bCs w:val="0"/>
-                <w:color w:val="auto"/>
-                <w:sz w:val="20"/>
-                <w:szCs w:val="20"/>
-                <w:vertAlign w:val="baseline"/>
-              </w:rPr>
-              <w:t>Off</w:t>
-            </w:r>
-          </w:p>
-        </w:tc>
-      </w:tr>
-    </w:tbl>
-    <w:p>
-      <w:pPr>
-        <w:numPr>
-          <w:ilvl w:val="0"/>
-          <w:numId w:val="0"/>
-        </w:numPr>
-        <w:ind w:left="0" w:leftChars="0" w:firstLine="400" w:firstLineChars="200"/>
-        <w:jc w:val="both"/>
-        <w:outlineLvl w:val="0"/>
-        <w:rPr>
-          <w:rFonts w:hint="eastAsia" w:asciiTheme="majorEastAsia" w:hAnsiTheme="majorEastAsia" w:eastAsiaTheme="majorEastAsia" w:cstheme="majorEastAsia"/>
-          <w:b w:val="0"/>
-          <w:bCs w:val="0"/>
-          <w:i w:val="0"/>
-          <w:iCs w:val="0"/>
-          <w:color w:val="auto"/>
-          <w:sz w:val="20"/>
-          <w:szCs w:val="20"/>
-        </w:rPr>
-      </w:pPr>
-      <w:r>
-        <w:rPr>
-          <w:rFonts w:hint="default" w:asciiTheme="majorEastAsia" w:hAnsiTheme="majorEastAsia" w:eastAsiaTheme="majorEastAsia" w:cstheme="majorEastAsia"/>
-          <w:b w:val="0"/>
-          <w:bCs w:val="0"/>
-          <w:i w:val="0"/>
-          <w:iCs w:val="0"/>
-          <w:color w:val="auto"/>
-          <w:sz w:val="20"/>
-          <w:szCs w:val="20"/>
-        </w:rPr>
-        <w:t>*To ON/OFF these defines, modify ‘${PROJ_ROOT}/rtl/ahb/interconnect/spmcu_ahb_ interconnect_define.svh’</w:t>
-      </w:r>
-    </w:p>
-    <w:p>
-      <w:pPr>
-        <w:pStyle w:val="2"/>
-        <w:rPr>
-          <w:rFonts w:hint="eastAsia" w:asciiTheme="minorEastAsia" w:hAnsiTheme="minorEastAsia" w:eastAsiaTheme="minorEastAsia" w:cstheme="minorEastAsia"/>
-          <w:color w:val="002060"/>
-        </w:rPr>
-      </w:pPr>
-      <w:r>
-        <w:rPr>
-          <w:rFonts w:hint="eastAsia" w:asciiTheme="minorEastAsia" w:hAnsiTheme="minorEastAsia" w:eastAsiaTheme="minorEastAsia" w:cstheme="minorEastAsia"/>
-          <w:color w:val="002060"/>
-        </w:rPr>
-        <w:t xml:space="preserve">Table </w:t>
-      </w:r>
-      <w:r>
-        <w:rPr>
-          <w:rFonts w:hint="eastAsia" w:asciiTheme="minorEastAsia" w:hAnsiTheme="minorEastAsia" w:eastAsiaTheme="minorEastAsia" w:cstheme="minorEastAsia"/>
-          <w:color w:val="002060"/>
-        </w:rPr>
-        <w:fldChar w:fldCharType="begin"/>
-      </w:r>
-      <w:r>
-        <w:rPr>
-          <w:rFonts w:hint="eastAsia" w:asciiTheme="minorEastAsia" w:hAnsiTheme="minorEastAsia" w:eastAsiaTheme="minorEastAsia" w:cstheme="minorEastAsia"/>
-          <w:color w:val="002060"/>
-        </w:rPr>
-        <w:instrText xml:space="preserve"> SEQ Table \* ARABIC </w:instrText>
-      </w:r>
-      <w:r>
-        <w:rPr>
-          <w:rFonts w:hint="eastAsia" w:asciiTheme="minorEastAsia" w:hAnsiTheme="minorEastAsia" w:eastAsiaTheme="minorEastAsia" w:cstheme="minorEastAsia"/>
-          <w:color w:val="002060"/>
-        </w:rPr>
-        <w:fldChar w:fldCharType="separate"/>
-      </w:r>
-      <w:r>
-        <w:rPr>
-          <w:rFonts w:hint="eastAsia" w:asciiTheme="minorEastAsia" w:hAnsiTheme="minorEastAsia" w:eastAsiaTheme="minorEastAsia" w:cstheme="minorEastAsia"/>
-          <w:color w:val="002060"/>
-        </w:rPr>
-        <w:t>5</w:t>
+        <w:t>6</w:t>
       </w:r>
       <w:r>
         <w:rPr>
@@ -7336,7 +8976,7 @@
           <w:rFonts w:hint="eastAsia" w:asciiTheme="minorEastAsia" w:hAnsiTheme="minorEastAsia" w:eastAsiaTheme="minorEastAsia" w:cstheme="minorEastAsia"/>
           <w:color w:val="002060"/>
         </w:rPr>
-        <w:t>6</w:t>
+        <w:t>7</w:t>
       </w:r>
       <w:r>
         <w:rPr>
@@ -12205,7 +13845,7 @@
                     </pic:cNvPicPr>
                   </pic:nvPicPr>
                   <pic:blipFill>
-                    <a:blip r:embed="rId5"/>
+                    <a:blip r:embed="rId7"/>
                     <a:stretch>
                       <a:fillRect/>
                     </a:stretch>

</xml_diff>

<commit_message>
Just backed data, nothing to say, nothing of rr_arbiter is done
</commit_message>
<xml_diff>
--- a/docs/SimpleMCU_MAS.docx
+++ b/docs/SimpleMCU_MAS.docx
@@ -10,6 +10,8 @@
           <w:szCs w:val="48"/>
         </w:rPr>
       </w:pPr>
+      <w:bookmarkStart w:id="0" w:name="_GoBack"/>
+      <w:bookmarkEnd w:id="0"/>
     </w:p>
     <w:p>
       <w:pPr>
@@ -5356,20 +5358,7 @@
           <w:sz w:val="20"/>
           <w:szCs w:val="20"/>
         </w:rPr>
-        <w:t>&lt;Chuc nang, tinh nang, diem dac biet&gt;</w:t>
-      </w:r>
-      <w:r>
-        <w:rPr>
-          <w:rFonts w:hint="default" w:asciiTheme="majorEastAsia" w:hAnsiTheme="majorEastAsia" w:eastAsiaTheme="majorEastAsia" w:cstheme="majorEastAsia"/>
-          <w:b w:val="0"/>
-          <w:bCs w:val="0"/>
-          <w:i w:val="0"/>
-          <w:iCs w:val="0"/>
-          <w:color w:val="auto"/>
-          <w:sz w:val="20"/>
-          <w:szCs w:val="20"/>
-        </w:rPr>
-        <w:t xml:space="preserve">: The Arbiter is an module that is responsible for  used for determine which device sent request to it is granted and </w:t>
+        <w:t xml:space="preserve">&lt;Chuc nang, tinh nang, diem dac biet&gt;: The Arbiter is an module that is responsible for  used for determine which device sent request to it is granted and </w:t>
       </w:r>
     </w:p>
     <w:p>
@@ -5463,8 +5452,6 @@
           </wp:inline>
         </w:drawing>
       </w:r>
-      <w:bookmarkStart w:id="0" w:name="_GoBack"/>
-      <w:bookmarkEnd w:id="0"/>
     </w:p>
     <w:p>
       <w:pPr>
@@ -5812,19 +5799,7 @@
                 <w:szCs w:val="20"/>
                 <w:vertAlign w:val="baseline"/>
               </w:rPr>
-              <w:t>N</w:t>
-            </w:r>
-            <w:r>
-              <w:rPr>
-                <w:rFonts w:hint="default" w:asciiTheme="majorEastAsia" w:hAnsiTheme="majorEastAsia" w:eastAsiaTheme="majorEastAsia" w:cstheme="majorEastAsia"/>
-                <w:b w:val="0"/>
-                <w:bCs w:val="0"/>
-                <w:color w:val="auto"/>
-                <w:sz w:val="20"/>
-                <w:szCs w:val="20"/>
-                <w:vertAlign w:val="baseline"/>
-              </w:rPr>
-              <w:t>R</w:t>
+              <w:t>NR</w:t>
             </w:r>
           </w:p>
         </w:tc>
@@ -5862,19 +5837,7 @@
                 <w:szCs w:val="20"/>
                 <w:vertAlign w:val="baseline"/>
               </w:rPr>
-              <w:t xml:space="preserve">Number of </w:t>
-            </w:r>
-            <w:r>
-              <w:rPr>
-                <w:rFonts w:hint="default" w:asciiTheme="majorEastAsia" w:hAnsiTheme="majorEastAsia" w:eastAsiaTheme="majorEastAsia" w:cstheme="majorEastAsia"/>
-                <w:b w:val="0"/>
-                <w:bCs w:val="0"/>
-                <w:color w:val="auto"/>
-                <w:sz w:val="20"/>
-                <w:szCs w:val="20"/>
-                <w:vertAlign w:val="baseline"/>
-              </w:rPr>
-              <w:t>request sent to the arbiter</w:t>
+              <w:t>Number of request sent to the arbiter</w:t>
             </w:r>
           </w:p>
           <w:p>
@@ -5928,43 +5891,7 @@
                 <w:szCs w:val="20"/>
                 <w:vertAlign w:val="baseline"/>
               </w:rPr>
-              <w:t>- Legal value: N</w:t>
-            </w:r>
-            <w:r>
-              <w:rPr>
-                <w:rFonts w:hint="default" w:asciiTheme="majorEastAsia" w:hAnsiTheme="majorEastAsia" w:eastAsiaTheme="majorEastAsia" w:cstheme="majorEastAsia"/>
-                <w:b w:val="0"/>
-                <w:bCs w:val="0"/>
-                <w:color w:val="auto"/>
-                <w:sz w:val="20"/>
-                <w:szCs w:val="20"/>
-                <w:vertAlign w:val="baseline"/>
-              </w:rPr>
-              <w:t>R</w:t>
-            </w:r>
-            <w:r>
-              <w:rPr>
-                <w:rFonts w:hint="default" w:asciiTheme="majorEastAsia" w:hAnsiTheme="majorEastAsia" w:eastAsiaTheme="majorEastAsia" w:cstheme="majorEastAsia"/>
-                <w:b w:val="0"/>
-                <w:bCs w:val="0"/>
-                <w:color w:val="auto"/>
-                <w:sz w:val="20"/>
-                <w:szCs w:val="20"/>
-                <w:vertAlign w:val="baseline"/>
-              </w:rPr>
-              <w:t xml:space="preserve"> &gt; </w:t>
-            </w:r>
-            <w:r>
-              <w:rPr>
-                <w:rFonts w:hint="default" w:asciiTheme="majorEastAsia" w:hAnsiTheme="majorEastAsia" w:eastAsiaTheme="majorEastAsia" w:cstheme="majorEastAsia"/>
-                <w:b w:val="0"/>
-                <w:bCs w:val="0"/>
-                <w:color w:val="auto"/>
-                <w:sz w:val="20"/>
-                <w:szCs w:val="20"/>
-                <w:vertAlign w:val="baseline"/>
-              </w:rPr>
-              <w:t>1</w:t>
+              <w:t>- Legal value: NR &gt; 1</w:t>
             </w:r>
           </w:p>
         </w:tc>
@@ -5973,6 +5900,7 @@
     <w:p>
       <w:pPr>
         <w:numPr>
+          <w:ilvl w:val="0"/>
           <w:numId w:val="0"/>
         </w:numPr>
         <w:ind w:left="0" w:leftChars="0" w:firstLine="400" w:firstLineChars="200"/>
@@ -6783,19 +6711,7 @@
                 <w:szCs w:val="20"/>
                 <w:vertAlign w:val="baseline"/>
               </w:rPr>
-              <w:t>N</w:t>
-            </w:r>
-            <w:r>
-              <w:rPr>
-                <w:rFonts w:hint="default" w:asciiTheme="majorEastAsia" w:hAnsiTheme="majorEastAsia" w:eastAsiaTheme="majorEastAsia" w:cstheme="majorEastAsia"/>
-                <w:b w:val="0"/>
-                <w:bCs w:val="0"/>
-                <w:color w:val="auto"/>
-                <w:sz w:val="20"/>
-                <w:szCs w:val="20"/>
-                <w:vertAlign w:val="baseline"/>
-              </w:rPr>
-              <w:t>R</w:t>
+              <w:t>NR</w:t>
             </w:r>
           </w:p>
         </w:tc>
@@ -6970,19 +6886,7 @@
                 <w:szCs w:val="20"/>
                 <w:vertAlign w:val="baseline"/>
               </w:rPr>
-              <w:t>N</w:t>
-            </w:r>
-            <w:r>
-              <w:rPr>
-                <w:rFonts w:hint="default" w:asciiTheme="majorEastAsia" w:hAnsiTheme="majorEastAsia" w:eastAsiaTheme="majorEastAsia" w:cstheme="majorEastAsia"/>
-                <w:b w:val="0"/>
-                <w:bCs w:val="0"/>
-                <w:color w:val="auto"/>
-                <w:sz w:val="20"/>
-                <w:szCs w:val="20"/>
-                <w:vertAlign w:val="baseline"/>
-              </w:rPr>
-              <w:t>R</w:t>
+              <w:t>NR</w:t>
             </w:r>
           </w:p>
         </w:tc>
@@ -7158,19 +7062,7 @@
                 <w:szCs w:val="20"/>
                 <w:vertAlign w:val="baseline"/>
               </w:rPr>
-              <w:t>N</w:t>
-            </w:r>
-            <w:r>
-              <w:rPr>
-                <w:rFonts w:hint="default" w:asciiTheme="majorEastAsia" w:hAnsiTheme="majorEastAsia" w:eastAsiaTheme="majorEastAsia" w:cstheme="majorEastAsia"/>
-                <w:b w:val="0"/>
-                <w:bCs w:val="0"/>
-                <w:color w:val="auto"/>
-                <w:sz w:val="20"/>
-                <w:szCs w:val="20"/>
-                <w:vertAlign w:val="baseline"/>
-              </w:rPr>
-              <w:t>R</w:t>
+              <w:t>NR</w:t>
             </w:r>
           </w:p>
         </w:tc>
@@ -7217,6 +7109,7 @@
     <w:p>
       <w:pPr>
         <w:numPr>
+          <w:ilvl w:val="0"/>
           <w:numId w:val="0"/>
         </w:numPr>
         <w:jc w:val="left"/>
@@ -7270,6 +7163,7 @@
     <w:p>
       <w:pPr>
         <w:numPr>
+          <w:ilvl w:val="0"/>
           <w:numId w:val="0"/>
         </w:numPr>
         <w:ind w:left="0" w:leftChars="0" w:firstLine="400" w:firstLineChars="200"/>

</xml_diff>